<commit_message>
style: ubah seluruh tombol di aplikasi menjadi icon-only dengan tooltip
</commit_message>
<xml_diff>
--- a/src/assets/img/data_samples/Template Perjanjian Kerja PPPK Paruh Waktu F4.docx
+++ b/src/assets/img/data_samples/Template Perjanjian Kerja PPPK Paruh Waktu F4.docx
@@ -33,6 +33,20 @@
         </w:rPr>
         <w:tab/>
       </w:r>
+    </w:p>
+    <w:p>
+      <w:pPr>
+        <w:tabs>
+          <w:tab w:val="center" w:pos="5127"/>
+        </w:tabs>
+        <w:spacing w:before="240" w:after="0" w:line="240" w:lineRule="auto"/>
+        <w:rPr>
+          <w:rFonts w:asciiTheme="majorBidi" w:hAnsiTheme="majorBidi" w:cstheme="majorBidi"/>
+          <w:b/>
+          <w:sz w:val="24"/>
+          <w:szCs w:val="24"/>
+        </w:rPr>
+      </w:pPr>
       <w:r>
         <w:rPr>
           <w:rFonts w:asciiTheme="majorBidi" w:hAnsiTheme="majorBidi" w:cstheme="majorBidi"/>
@@ -206,7 +220,7 @@
           </mc:Choice>
           <mc:Fallback>
             <w:pict>
-              <v:line w14:anchorId="4D4D8A96" id="Straight Connector 5" o:spid="_x0000_s1026" style="position:absolute;z-index:251659264;visibility:visible;mso-wrap-style:square;mso-width-percent:0;mso-height-percent:0;mso-wrap-distance-left:9pt;mso-wrap-distance-top:-3e-5mm;mso-wrap-distance-right:9pt;mso-wrap-distance-bottom:-3e-5mm;mso-position-horizontal:absolute;mso-position-horizontal-relative:text;mso-position-vertical:absolute;mso-position-vertical-relative:text;mso-width-percent:0;mso-height-percent:0;mso-width-relative:page;mso-height-relative:margin" from="-6.8pt,45.4pt" to="510.7pt,45.4pt" o:gfxdata="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" strokecolor="windowText" strokeweight="4pt">
+              <v:line w14:anchorId="0BFBA6F8" id="Straight Connector 5" o:spid="_x0000_s1026" style="position:absolute;z-index:251659264;visibility:visible;mso-wrap-style:square;mso-width-percent:0;mso-height-percent:0;mso-wrap-distance-left:9pt;mso-wrap-distance-top:-3e-5mm;mso-wrap-distance-right:9pt;mso-wrap-distance-bottom:-3e-5mm;mso-position-horizontal:absolute;mso-position-horizontal-relative:text;mso-position-vertical:absolute;mso-position-vertical-relative:text;mso-width-percent:0;mso-height-percent:0;mso-width-relative:page;mso-height-relative:margin" from="-6.8pt,45.4pt" to="510.7pt,45.4pt" o:gfxdata="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" strokecolor="windowText" strokeweight="4pt">
                 <v:stroke linestyle="thickThin" joinstyle="miter"/>
                 <o:lock v:ext="edit" shapetype="f"/>
               </v:line>
@@ -505,6 +519,7 @@
           <w:szCs w:val="24"/>
         </w:rPr>
       </w:pPr>
+      <w:proofErr w:type="spellStart"/>
       <w:r>
         <w:rPr>
           <w:rFonts w:ascii="Bookman Old Style" w:hAnsi="Bookman Old Style"/>
@@ -513,6 +528,7 @@
         </w:rPr>
         <w:t>Jabatan</w:t>
       </w:r>
+      <w:proofErr w:type="spellEnd"/>
       <w:r>
         <w:rPr>
           <w:rFonts w:ascii="Bookman Old Style" w:hAnsi="Bookman Old Style"/>
@@ -1241,6 +1257,7 @@
           <w:szCs w:val="24"/>
         </w:rPr>
       </w:pPr>
+      <w:proofErr w:type="spellStart"/>
       <w:r>
         <w:rPr>
           <w:rFonts w:ascii="Bookman Old Style" w:hAnsi="Bookman Old Style"/>
@@ -1249,7 +1266,17 @@
           <w:szCs w:val="24"/>
         </w:rPr>
         <w:lastRenderedPageBreak/>
-        <w:t>Pasal 2</w:t>
+        <w:t>Pasal</w:t>
+      </w:r>
+      <w:proofErr w:type="spellEnd"/>
+      <w:r>
+        <w:rPr>
+          <w:rFonts w:ascii="Bookman Old Style" w:hAnsi="Bookman Old Style"/>
+          <w:b/>
+          <w:sz w:val="24"/>
+          <w:szCs w:val="24"/>
+        </w:rPr>
+        <w:t xml:space="preserve"> 2</w:t>
       </w:r>
     </w:p>
     <w:p>
@@ -1267,6 +1294,7 @@
           <w:szCs w:val="24"/>
         </w:rPr>
       </w:pPr>
+      <w:proofErr w:type="spellStart"/>
       <w:r>
         <w:rPr>
           <w:rFonts w:ascii="Bookman Old Style" w:hAnsi="Bookman Old Style"/>
@@ -1274,8 +1302,29 @@
           <w:sz w:val="24"/>
           <w:szCs w:val="24"/>
         </w:rPr>
-        <w:t>Tugas Pekerjaan</w:t>
-      </w:r>
+        <w:t>Tugas</w:t>
+      </w:r>
+      <w:proofErr w:type="spellEnd"/>
+      <w:r>
+        <w:rPr>
+          <w:rFonts w:ascii="Bookman Old Style" w:hAnsi="Bookman Old Style"/>
+          <w:b/>
+          <w:sz w:val="24"/>
+          <w:szCs w:val="24"/>
+        </w:rPr>
+        <w:t xml:space="preserve"> </w:t>
+      </w:r>
+      <w:proofErr w:type="spellStart"/>
+      <w:r>
+        <w:rPr>
+          <w:rFonts w:ascii="Bookman Old Style" w:hAnsi="Bookman Old Style"/>
+          <w:b/>
+          <w:sz w:val="24"/>
+          <w:szCs w:val="24"/>
+        </w:rPr>
+        <w:t>Pekerjaan</w:t>
+      </w:r>
+      <w:proofErr w:type="spellEnd"/>
     </w:p>
     <w:p>
       <w:pPr>
@@ -1296,14 +1345,178 @@
           <w:szCs w:val="24"/>
         </w:rPr>
       </w:pPr>
-      <w:r>
-        <w:rPr>
-          <w:rFonts w:ascii="Bookman Old Style" w:hAnsi="Bookman Old Style"/>
-          <w:sz w:val="24"/>
-          <w:szCs w:val="24"/>
-        </w:rPr>
-        <w:t>Pihak Kesatu membuat dan menetapkan tugas pekerjaan yang harus dilaksanakan oleh Pihak Kedua</w:t>
-      </w:r>
+      <w:proofErr w:type="spellStart"/>
+      <w:r>
+        <w:rPr>
+          <w:rFonts w:ascii="Bookman Old Style" w:hAnsi="Bookman Old Style"/>
+          <w:sz w:val="24"/>
+          <w:szCs w:val="24"/>
+        </w:rPr>
+        <w:t>Pihak</w:t>
+      </w:r>
+      <w:proofErr w:type="spellEnd"/>
+      <w:r>
+        <w:rPr>
+          <w:rFonts w:ascii="Bookman Old Style" w:hAnsi="Bookman Old Style"/>
+          <w:sz w:val="24"/>
+          <w:szCs w:val="24"/>
+        </w:rPr>
+        <w:t xml:space="preserve"> </w:t>
+      </w:r>
+      <w:proofErr w:type="spellStart"/>
+      <w:r>
+        <w:rPr>
+          <w:rFonts w:ascii="Bookman Old Style" w:hAnsi="Bookman Old Style"/>
+          <w:sz w:val="24"/>
+          <w:szCs w:val="24"/>
+        </w:rPr>
+        <w:t>Kesatu</w:t>
+      </w:r>
+      <w:proofErr w:type="spellEnd"/>
+      <w:r>
+        <w:rPr>
+          <w:rFonts w:ascii="Bookman Old Style" w:hAnsi="Bookman Old Style"/>
+          <w:sz w:val="24"/>
+          <w:szCs w:val="24"/>
+        </w:rPr>
+        <w:t xml:space="preserve"> </w:t>
+      </w:r>
+      <w:proofErr w:type="spellStart"/>
+      <w:r>
+        <w:rPr>
+          <w:rFonts w:ascii="Bookman Old Style" w:hAnsi="Bookman Old Style"/>
+          <w:sz w:val="24"/>
+          <w:szCs w:val="24"/>
+        </w:rPr>
+        <w:t>membuat</w:t>
+      </w:r>
+      <w:proofErr w:type="spellEnd"/>
+      <w:r>
+        <w:rPr>
+          <w:rFonts w:ascii="Bookman Old Style" w:hAnsi="Bookman Old Style"/>
+          <w:sz w:val="24"/>
+          <w:szCs w:val="24"/>
+        </w:rPr>
+        <w:t xml:space="preserve"> dan </w:t>
+      </w:r>
+      <w:proofErr w:type="spellStart"/>
+      <w:r>
+        <w:rPr>
+          <w:rFonts w:ascii="Bookman Old Style" w:hAnsi="Bookman Old Style"/>
+          <w:sz w:val="24"/>
+          <w:szCs w:val="24"/>
+        </w:rPr>
+        <w:t>menetapkan</w:t>
+      </w:r>
+      <w:proofErr w:type="spellEnd"/>
+      <w:r>
+        <w:rPr>
+          <w:rFonts w:ascii="Bookman Old Style" w:hAnsi="Bookman Old Style"/>
+          <w:sz w:val="24"/>
+          <w:szCs w:val="24"/>
+        </w:rPr>
+        <w:t xml:space="preserve"> </w:t>
+      </w:r>
+      <w:proofErr w:type="spellStart"/>
+      <w:r>
+        <w:rPr>
+          <w:rFonts w:ascii="Bookman Old Style" w:hAnsi="Bookman Old Style"/>
+          <w:sz w:val="24"/>
+          <w:szCs w:val="24"/>
+        </w:rPr>
+        <w:t>tugas</w:t>
+      </w:r>
+      <w:proofErr w:type="spellEnd"/>
+      <w:r>
+        <w:rPr>
+          <w:rFonts w:ascii="Bookman Old Style" w:hAnsi="Bookman Old Style"/>
+          <w:sz w:val="24"/>
+          <w:szCs w:val="24"/>
+        </w:rPr>
+        <w:t xml:space="preserve"> </w:t>
+      </w:r>
+      <w:proofErr w:type="spellStart"/>
+      <w:r>
+        <w:rPr>
+          <w:rFonts w:ascii="Bookman Old Style" w:hAnsi="Bookman Old Style"/>
+          <w:sz w:val="24"/>
+          <w:szCs w:val="24"/>
+        </w:rPr>
+        <w:t>pekerjaan</w:t>
+      </w:r>
+      <w:proofErr w:type="spellEnd"/>
+      <w:r>
+        <w:rPr>
+          <w:rFonts w:ascii="Bookman Old Style" w:hAnsi="Bookman Old Style"/>
+          <w:sz w:val="24"/>
+          <w:szCs w:val="24"/>
+        </w:rPr>
+        <w:t xml:space="preserve"> yang </w:t>
+      </w:r>
+      <w:proofErr w:type="spellStart"/>
+      <w:r>
+        <w:rPr>
+          <w:rFonts w:ascii="Bookman Old Style" w:hAnsi="Bookman Old Style"/>
+          <w:sz w:val="24"/>
+          <w:szCs w:val="24"/>
+        </w:rPr>
+        <w:t>harus</w:t>
+      </w:r>
+      <w:proofErr w:type="spellEnd"/>
+      <w:r>
+        <w:rPr>
+          <w:rFonts w:ascii="Bookman Old Style" w:hAnsi="Bookman Old Style"/>
+          <w:sz w:val="24"/>
+          <w:szCs w:val="24"/>
+        </w:rPr>
+        <w:t xml:space="preserve"> </w:t>
+      </w:r>
+      <w:proofErr w:type="spellStart"/>
+      <w:r>
+        <w:rPr>
+          <w:rFonts w:ascii="Bookman Old Style" w:hAnsi="Bookman Old Style"/>
+          <w:sz w:val="24"/>
+          <w:szCs w:val="24"/>
+        </w:rPr>
+        <w:t>dilaksanakan</w:t>
+      </w:r>
+      <w:proofErr w:type="spellEnd"/>
+      <w:r>
+        <w:rPr>
+          <w:rFonts w:ascii="Bookman Old Style" w:hAnsi="Bookman Old Style"/>
+          <w:sz w:val="24"/>
+          <w:szCs w:val="24"/>
+        </w:rPr>
+        <w:t xml:space="preserve"> oleh </w:t>
+      </w:r>
+      <w:proofErr w:type="spellStart"/>
+      <w:r>
+        <w:rPr>
+          <w:rFonts w:ascii="Bookman Old Style" w:hAnsi="Bookman Old Style"/>
+          <w:sz w:val="24"/>
+          <w:szCs w:val="24"/>
+        </w:rPr>
+        <w:t>Pihak</w:t>
+      </w:r>
+      <w:proofErr w:type="spellEnd"/>
+      <w:r>
+        <w:rPr>
+          <w:rFonts w:ascii="Bookman Old Style" w:hAnsi="Bookman Old Style"/>
+          <w:sz w:val="24"/>
+          <w:szCs w:val="24"/>
+        </w:rPr>
+        <w:t xml:space="preserve"> </w:t>
+      </w:r>
+      <w:proofErr w:type="spellStart"/>
+      <w:r>
+        <w:rPr>
+          <w:rFonts w:ascii="Bookman Old Style" w:hAnsi="Bookman Old Style"/>
+          <w:sz w:val="24"/>
+          <w:szCs w:val="24"/>
+        </w:rPr>
+        <w:t>Kedua</w:t>
+      </w:r>
+      <w:proofErr w:type="spellEnd"/>
       <w:r>
         <w:rPr>
           <w:rFonts w:ascii="Bookman Old Style" w:hAnsi="Bookman Old Style"/>
@@ -1332,21 +1545,239 @@
           <w:szCs w:val="24"/>
         </w:rPr>
       </w:pPr>
-      <w:r>
-        <w:rPr>
-          <w:rFonts w:ascii="Bookman Old Style" w:hAnsi="Bookman Old Style"/>
-          <w:sz w:val="24"/>
-          <w:szCs w:val="24"/>
-        </w:rPr>
-        <w:t xml:space="preserve">Pihak Kedua wajib melaksanakan </w:t>
-      </w:r>
-      <w:r>
-        <w:rPr>
-          <w:rFonts w:ascii="Bookman Old Style" w:hAnsi="Bookman Old Style"/>
-          <w:sz w:val="24"/>
-          <w:szCs w:val="24"/>
-        </w:rPr>
-        <w:t>tugas pekerjaan yang diberikan Pihak Kesatu dengan sebaik-baiknya dan rasa tanggung jawab.</w:t>
+      <w:proofErr w:type="spellStart"/>
+      <w:r>
+        <w:rPr>
+          <w:rFonts w:ascii="Bookman Old Style" w:hAnsi="Bookman Old Style"/>
+          <w:sz w:val="24"/>
+          <w:szCs w:val="24"/>
+        </w:rPr>
+        <w:t>Pihak</w:t>
+      </w:r>
+      <w:proofErr w:type="spellEnd"/>
+      <w:r>
+        <w:rPr>
+          <w:rFonts w:ascii="Bookman Old Style" w:hAnsi="Bookman Old Style"/>
+          <w:sz w:val="24"/>
+          <w:szCs w:val="24"/>
+        </w:rPr>
+        <w:t xml:space="preserve"> </w:t>
+      </w:r>
+      <w:proofErr w:type="spellStart"/>
+      <w:r>
+        <w:rPr>
+          <w:rFonts w:ascii="Bookman Old Style" w:hAnsi="Bookman Old Style"/>
+          <w:sz w:val="24"/>
+          <w:szCs w:val="24"/>
+        </w:rPr>
+        <w:t>Kedua</w:t>
+      </w:r>
+      <w:proofErr w:type="spellEnd"/>
+      <w:r>
+        <w:rPr>
+          <w:rFonts w:ascii="Bookman Old Style" w:hAnsi="Bookman Old Style"/>
+          <w:sz w:val="24"/>
+          <w:szCs w:val="24"/>
+        </w:rPr>
+        <w:t xml:space="preserve"> </w:t>
+      </w:r>
+      <w:proofErr w:type="spellStart"/>
+      <w:r>
+        <w:rPr>
+          <w:rFonts w:ascii="Bookman Old Style" w:hAnsi="Bookman Old Style"/>
+          <w:sz w:val="24"/>
+          <w:szCs w:val="24"/>
+        </w:rPr>
+        <w:t>wajib</w:t>
+      </w:r>
+      <w:proofErr w:type="spellEnd"/>
+      <w:r>
+        <w:rPr>
+          <w:rFonts w:ascii="Bookman Old Style" w:hAnsi="Bookman Old Style"/>
+          <w:sz w:val="24"/>
+          <w:szCs w:val="24"/>
+        </w:rPr>
+        <w:t xml:space="preserve"> </w:t>
+      </w:r>
+      <w:proofErr w:type="spellStart"/>
+      <w:r>
+        <w:rPr>
+          <w:rFonts w:ascii="Bookman Old Style" w:hAnsi="Bookman Old Style"/>
+          <w:sz w:val="24"/>
+          <w:szCs w:val="24"/>
+        </w:rPr>
+        <w:t>melaksanakan</w:t>
+      </w:r>
+      <w:proofErr w:type="spellEnd"/>
+      <w:r>
+        <w:rPr>
+          <w:rFonts w:ascii="Bookman Old Style" w:hAnsi="Bookman Old Style"/>
+          <w:sz w:val="24"/>
+          <w:szCs w:val="24"/>
+        </w:rPr>
+        <w:t xml:space="preserve"> </w:t>
+      </w:r>
+      <w:proofErr w:type="spellStart"/>
+      <w:r>
+        <w:rPr>
+          <w:rFonts w:ascii="Bookman Old Style" w:hAnsi="Bookman Old Style"/>
+          <w:sz w:val="24"/>
+          <w:szCs w:val="24"/>
+        </w:rPr>
+        <w:t>tugas</w:t>
+      </w:r>
+      <w:proofErr w:type="spellEnd"/>
+      <w:r>
+        <w:rPr>
+          <w:rFonts w:ascii="Bookman Old Style" w:hAnsi="Bookman Old Style"/>
+          <w:sz w:val="24"/>
+          <w:szCs w:val="24"/>
+        </w:rPr>
+        <w:t xml:space="preserve"> </w:t>
+      </w:r>
+      <w:proofErr w:type="spellStart"/>
+      <w:r>
+        <w:rPr>
+          <w:rFonts w:ascii="Bookman Old Style" w:hAnsi="Bookman Old Style"/>
+          <w:sz w:val="24"/>
+          <w:szCs w:val="24"/>
+        </w:rPr>
+        <w:t>pekerjaan</w:t>
+      </w:r>
+      <w:proofErr w:type="spellEnd"/>
+      <w:r>
+        <w:rPr>
+          <w:rFonts w:ascii="Bookman Old Style" w:hAnsi="Bookman Old Style"/>
+          <w:sz w:val="24"/>
+          <w:szCs w:val="24"/>
+        </w:rPr>
+        <w:t xml:space="preserve"> yang </w:t>
+      </w:r>
+      <w:proofErr w:type="spellStart"/>
+      <w:r>
+        <w:rPr>
+          <w:rFonts w:ascii="Bookman Old Style" w:hAnsi="Bookman Old Style"/>
+          <w:sz w:val="24"/>
+          <w:szCs w:val="24"/>
+        </w:rPr>
+        <w:t>diberikan</w:t>
+      </w:r>
+      <w:proofErr w:type="spellEnd"/>
+      <w:r>
+        <w:rPr>
+          <w:rFonts w:ascii="Bookman Old Style" w:hAnsi="Bookman Old Style"/>
+          <w:sz w:val="24"/>
+          <w:szCs w:val="24"/>
+        </w:rPr>
+        <w:t xml:space="preserve"> </w:t>
+      </w:r>
+      <w:proofErr w:type="spellStart"/>
+      <w:r>
+        <w:rPr>
+          <w:rFonts w:ascii="Bookman Old Style" w:hAnsi="Bookman Old Style"/>
+          <w:sz w:val="24"/>
+          <w:szCs w:val="24"/>
+        </w:rPr>
+        <w:t>Pihak</w:t>
+      </w:r>
+      <w:proofErr w:type="spellEnd"/>
+      <w:r>
+        <w:rPr>
+          <w:rFonts w:ascii="Bookman Old Style" w:hAnsi="Bookman Old Style"/>
+          <w:sz w:val="24"/>
+          <w:szCs w:val="24"/>
+        </w:rPr>
+        <w:t xml:space="preserve"> </w:t>
+      </w:r>
+      <w:proofErr w:type="spellStart"/>
+      <w:r>
+        <w:rPr>
+          <w:rFonts w:ascii="Bookman Old Style" w:hAnsi="Bookman Old Style"/>
+          <w:sz w:val="24"/>
+          <w:szCs w:val="24"/>
+        </w:rPr>
+        <w:t>Kesatu</w:t>
+      </w:r>
+      <w:proofErr w:type="spellEnd"/>
+      <w:r>
+        <w:rPr>
+          <w:rFonts w:ascii="Bookman Old Style" w:hAnsi="Bookman Old Style"/>
+          <w:sz w:val="24"/>
+          <w:szCs w:val="24"/>
+        </w:rPr>
+        <w:t xml:space="preserve"> </w:t>
+      </w:r>
+      <w:proofErr w:type="spellStart"/>
+      <w:r>
+        <w:rPr>
+          <w:rFonts w:ascii="Bookman Old Style" w:hAnsi="Bookman Old Style"/>
+          <w:sz w:val="24"/>
+          <w:szCs w:val="24"/>
+        </w:rPr>
+        <w:t>dengan</w:t>
+      </w:r>
+      <w:proofErr w:type="spellEnd"/>
+      <w:r>
+        <w:rPr>
+          <w:rFonts w:ascii="Bookman Old Style" w:hAnsi="Bookman Old Style"/>
+          <w:sz w:val="24"/>
+          <w:szCs w:val="24"/>
+        </w:rPr>
+        <w:t xml:space="preserve"> </w:t>
+      </w:r>
+      <w:proofErr w:type="spellStart"/>
+      <w:r>
+        <w:rPr>
+          <w:rFonts w:ascii="Bookman Old Style" w:hAnsi="Bookman Old Style"/>
+          <w:sz w:val="24"/>
+          <w:szCs w:val="24"/>
+        </w:rPr>
+        <w:t>sebaik-baiknya</w:t>
+      </w:r>
+      <w:proofErr w:type="spellEnd"/>
+      <w:r>
+        <w:rPr>
+          <w:rFonts w:ascii="Bookman Old Style" w:hAnsi="Bookman Old Style"/>
+          <w:sz w:val="24"/>
+          <w:szCs w:val="24"/>
+        </w:rPr>
+        <w:t xml:space="preserve"> dan rasa </w:t>
+      </w:r>
+      <w:proofErr w:type="spellStart"/>
+      <w:r>
+        <w:rPr>
+          <w:rFonts w:ascii="Bookman Old Style" w:hAnsi="Bookman Old Style"/>
+          <w:sz w:val="24"/>
+          <w:szCs w:val="24"/>
+        </w:rPr>
+        <w:t>tanggung</w:t>
+      </w:r>
+      <w:proofErr w:type="spellEnd"/>
+      <w:r>
+        <w:rPr>
+          <w:rFonts w:ascii="Bookman Old Style" w:hAnsi="Bookman Old Style"/>
+          <w:sz w:val="24"/>
+          <w:szCs w:val="24"/>
+        </w:rPr>
+        <w:t xml:space="preserve"> </w:t>
+      </w:r>
+      <w:proofErr w:type="spellStart"/>
+      <w:r>
+        <w:rPr>
+          <w:rFonts w:ascii="Bookman Old Style" w:hAnsi="Bookman Old Style"/>
+          <w:sz w:val="24"/>
+          <w:szCs w:val="24"/>
+        </w:rPr>
+        <w:t>jawab</w:t>
+      </w:r>
+      <w:proofErr w:type="spellEnd"/>
+      <w:r>
+        <w:rPr>
+          <w:rFonts w:ascii="Bookman Old Style" w:hAnsi="Bookman Old Style"/>
+          <w:sz w:val="24"/>
+          <w:szCs w:val="24"/>
+        </w:rPr>
+        <w:t>.</w:t>
       </w:r>
     </w:p>
     <w:p>
@@ -1380,6 +1811,7 @@
           <w:szCs w:val="24"/>
         </w:rPr>
       </w:pPr>
+      <w:proofErr w:type="spellStart"/>
       <w:r>
         <w:rPr>
           <w:rFonts w:ascii="Bookman Old Style" w:hAnsi="Bookman Old Style"/>
@@ -1387,7 +1819,17 @@
           <w:sz w:val="24"/>
           <w:szCs w:val="24"/>
         </w:rPr>
-        <w:t>Pasal 3</w:t>
+        <w:t>Pasal</w:t>
+      </w:r>
+      <w:proofErr w:type="spellEnd"/>
+      <w:r>
+        <w:rPr>
+          <w:rFonts w:ascii="Bookman Old Style" w:hAnsi="Bookman Old Style"/>
+          <w:b/>
+          <w:sz w:val="24"/>
+          <w:szCs w:val="24"/>
+        </w:rPr>
+        <w:t xml:space="preserve"> 3</w:t>
       </w:r>
     </w:p>
     <w:p>
@@ -1635,6 +2077,7 @@
           <w:szCs w:val="24"/>
         </w:rPr>
       </w:pPr>
+      <w:proofErr w:type="spellStart"/>
       <w:r>
         <w:rPr>
           <w:rFonts w:ascii="Bookman Old Style" w:hAnsi="Bookman Old Style"/>
@@ -1642,7 +2085,17 @@
           <w:sz w:val="24"/>
           <w:szCs w:val="24"/>
         </w:rPr>
-        <w:t>Pasal 5</w:t>
+        <w:t>Pasal</w:t>
+      </w:r>
+      <w:proofErr w:type="spellEnd"/>
+      <w:r>
+        <w:rPr>
+          <w:rFonts w:ascii="Bookman Old Style" w:hAnsi="Bookman Old Style"/>
+          <w:b/>
+          <w:sz w:val="24"/>
+          <w:szCs w:val="24"/>
+        </w:rPr>
+        <w:t xml:space="preserve"> 5</w:t>
       </w:r>
     </w:p>
     <w:p>
@@ -1658,6 +2111,7 @@
           <w:szCs w:val="24"/>
         </w:rPr>
       </w:pPr>
+      <w:proofErr w:type="spellStart"/>
       <w:r>
         <w:rPr>
           <w:rFonts w:ascii="Bookman Old Style" w:hAnsi="Bookman Old Style"/>
@@ -1667,6 +2121,7 @@
         </w:rPr>
         <w:t>Disiplin</w:t>
       </w:r>
+      <w:proofErr w:type="spellEnd"/>
     </w:p>
     <w:p>
       <w:pPr>
@@ -1688,13 +2143,131 @@
           <w:szCs w:val="24"/>
         </w:rPr>
       </w:pPr>
-      <w:r>
-        <w:rPr>
-          <w:rFonts w:ascii="Bookman Old Style" w:hAnsi="Bookman Old Style"/>
-          <w:sz w:val="24"/>
-          <w:szCs w:val="24"/>
-        </w:rPr>
-        <w:t>Pihak Kedua wajib memenuhi semua kewajiban dan larangan.</w:t>
+      <w:proofErr w:type="spellStart"/>
+      <w:r>
+        <w:rPr>
+          <w:rFonts w:ascii="Bookman Old Style" w:hAnsi="Bookman Old Style"/>
+          <w:sz w:val="24"/>
+          <w:szCs w:val="24"/>
+        </w:rPr>
+        <w:t>Pihak</w:t>
+      </w:r>
+      <w:proofErr w:type="spellEnd"/>
+      <w:r>
+        <w:rPr>
+          <w:rFonts w:ascii="Bookman Old Style" w:hAnsi="Bookman Old Style"/>
+          <w:sz w:val="24"/>
+          <w:szCs w:val="24"/>
+        </w:rPr>
+        <w:t xml:space="preserve"> </w:t>
+      </w:r>
+      <w:proofErr w:type="spellStart"/>
+      <w:r>
+        <w:rPr>
+          <w:rFonts w:ascii="Bookman Old Style" w:hAnsi="Bookman Old Style"/>
+          <w:sz w:val="24"/>
+          <w:szCs w:val="24"/>
+        </w:rPr>
+        <w:t>Kedua</w:t>
+      </w:r>
+      <w:proofErr w:type="spellEnd"/>
+      <w:r>
+        <w:rPr>
+          <w:rFonts w:ascii="Bookman Old Style" w:hAnsi="Bookman Old Style"/>
+          <w:sz w:val="24"/>
+          <w:szCs w:val="24"/>
+        </w:rPr>
+        <w:t xml:space="preserve"> </w:t>
+      </w:r>
+      <w:proofErr w:type="spellStart"/>
+      <w:r>
+        <w:rPr>
+          <w:rFonts w:ascii="Bookman Old Style" w:hAnsi="Bookman Old Style"/>
+          <w:sz w:val="24"/>
+          <w:szCs w:val="24"/>
+        </w:rPr>
+        <w:t>wajib</w:t>
+      </w:r>
+      <w:proofErr w:type="spellEnd"/>
+      <w:r>
+        <w:rPr>
+          <w:rFonts w:ascii="Bookman Old Style" w:hAnsi="Bookman Old Style"/>
+          <w:sz w:val="24"/>
+          <w:szCs w:val="24"/>
+        </w:rPr>
+        <w:t xml:space="preserve"> </w:t>
+      </w:r>
+      <w:proofErr w:type="spellStart"/>
+      <w:r>
+        <w:rPr>
+          <w:rFonts w:ascii="Bookman Old Style" w:hAnsi="Bookman Old Style"/>
+          <w:sz w:val="24"/>
+          <w:szCs w:val="24"/>
+        </w:rPr>
+        <w:t>memenuhi</w:t>
+      </w:r>
+      <w:proofErr w:type="spellEnd"/>
+      <w:r>
+        <w:rPr>
+          <w:rFonts w:ascii="Bookman Old Style" w:hAnsi="Bookman Old Style"/>
+          <w:sz w:val="24"/>
+          <w:szCs w:val="24"/>
+        </w:rPr>
+        <w:t xml:space="preserve"> </w:t>
+      </w:r>
+      <w:proofErr w:type="spellStart"/>
+      <w:r>
+        <w:rPr>
+          <w:rFonts w:ascii="Bookman Old Style" w:hAnsi="Bookman Old Style"/>
+          <w:sz w:val="24"/>
+          <w:szCs w:val="24"/>
+        </w:rPr>
+        <w:t>semua</w:t>
+      </w:r>
+      <w:proofErr w:type="spellEnd"/>
+      <w:r>
+        <w:rPr>
+          <w:rFonts w:ascii="Bookman Old Style" w:hAnsi="Bookman Old Style"/>
+          <w:sz w:val="24"/>
+          <w:szCs w:val="24"/>
+        </w:rPr>
+        <w:t xml:space="preserve"> </w:t>
+      </w:r>
+      <w:proofErr w:type="spellStart"/>
+      <w:r>
+        <w:rPr>
+          <w:rFonts w:ascii="Bookman Old Style" w:hAnsi="Bookman Old Style"/>
+          <w:sz w:val="24"/>
+          <w:szCs w:val="24"/>
+        </w:rPr>
+        <w:t>kewajiban</w:t>
+      </w:r>
+      <w:proofErr w:type="spellEnd"/>
+      <w:r>
+        <w:rPr>
+          <w:rFonts w:ascii="Bookman Old Style" w:hAnsi="Bookman Old Style"/>
+          <w:sz w:val="24"/>
+          <w:szCs w:val="24"/>
+        </w:rPr>
+        <w:t xml:space="preserve"> dan </w:t>
+      </w:r>
+      <w:proofErr w:type="spellStart"/>
+      <w:r>
+        <w:rPr>
+          <w:rFonts w:ascii="Bookman Old Style" w:hAnsi="Bookman Old Style"/>
+          <w:sz w:val="24"/>
+          <w:szCs w:val="24"/>
+        </w:rPr>
+        <w:t>larangan</w:t>
+      </w:r>
+      <w:proofErr w:type="spellEnd"/>
+      <w:r>
+        <w:rPr>
+          <w:rFonts w:ascii="Bookman Old Style" w:hAnsi="Bookman Old Style"/>
+          <w:sz w:val="24"/>
+          <w:szCs w:val="24"/>
+        </w:rPr>
+        <w:t>.</w:t>
       </w:r>
     </w:p>
     <w:p>
@@ -1717,14 +2290,152 @@
           <w:szCs w:val="24"/>
         </w:rPr>
       </w:pPr>
-      <w:r>
-        <w:rPr>
-          <w:rFonts w:ascii="Bookman Old Style" w:hAnsi="Bookman Old Style"/>
-          <w:sz w:val="24"/>
-          <w:szCs w:val="24"/>
-        </w:rPr>
-        <w:t>Kewajiban bagi Pihak Kedua sebagaimana dimaksud pada ayat (1) meliputi :</w:t>
-      </w:r>
+      <w:proofErr w:type="spellStart"/>
+      <w:r>
+        <w:rPr>
+          <w:rFonts w:ascii="Bookman Old Style" w:hAnsi="Bookman Old Style"/>
+          <w:sz w:val="24"/>
+          <w:szCs w:val="24"/>
+        </w:rPr>
+        <w:t>Kewajiban</w:t>
+      </w:r>
+      <w:proofErr w:type="spellEnd"/>
+      <w:r>
+        <w:rPr>
+          <w:rFonts w:ascii="Bookman Old Style" w:hAnsi="Bookman Old Style"/>
+          <w:sz w:val="24"/>
+          <w:szCs w:val="24"/>
+        </w:rPr>
+        <w:t xml:space="preserve"> </w:t>
+      </w:r>
+      <w:proofErr w:type="spellStart"/>
+      <w:r>
+        <w:rPr>
+          <w:rFonts w:ascii="Bookman Old Style" w:hAnsi="Bookman Old Style"/>
+          <w:sz w:val="24"/>
+          <w:szCs w:val="24"/>
+        </w:rPr>
+        <w:t>bagi</w:t>
+      </w:r>
+      <w:proofErr w:type="spellEnd"/>
+      <w:r>
+        <w:rPr>
+          <w:rFonts w:ascii="Bookman Old Style" w:hAnsi="Bookman Old Style"/>
+          <w:sz w:val="24"/>
+          <w:szCs w:val="24"/>
+        </w:rPr>
+        <w:t xml:space="preserve"> </w:t>
+      </w:r>
+      <w:proofErr w:type="spellStart"/>
+      <w:r>
+        <w:rPr>
+          <w:rFonts w:ascii="Bookman Old Style" w:hAnsi="Bookman Old Style"/>
+          <w:sz w:val="24"/>
+          <w:szCs w:val="24"/>
+        </w:rPr>
+        <w:t>Pihak</w:t>
+      </w:r>
+      <w:proofErr w:type="spellEnd"/>
+      <w:r>
+        <w:rPr>
+          <w:rFonts w:ascii="Bookman Old Style" w:hAnsi="Bookman Old Style"/>
+          <w:sz w:val="24"/>
+          <w:szCs w:val="24"/>
+        </w:rPr>
+        <w:t xml:space="preserve"> </w:t>
+      </w:r>
+      <w:proofErr w:type="spellStart"/>
+      <w:r>
+        <w:rPr>
+          <w:rFonts w:ascii="Bookman Old Style" w:hAnsi="Bookman Old Style"/>
+          <w:sz w:val="24"/>
+          <w:szCs w:val="24"/>
+        </w:rPr>
+        <w:t>Kedua</w:t>
+      </w:r>
+      <w:proofErr w:type="spellEnd"/>
+      <w:r>
+        <w:rPr>
+          <w:rFonts w:ascii="Bookman Old Style" w:hAnsi="Bookman Old Style"/>
+          <w:sz w:val="24"/>
+          <w:szCs w:val="24"/>
+        </w:rPr>
+        <w:t xml:space="preserve"> </w:t>
+      </w:r>
+      <w:proofErr w:type="spellStart"/>
+      <w:r>
+        <w:rPr>
+          <w:rFonts w:ascii="Bookman Old Style" w:hAnsi="Bookman Old Style"/>
+          <w:sz w:val="24"/>
+          <w:szCs w:val="24"/>
+        </w:rPr>
+        <w:t>sebagaimana</w:t>
+      </w:r>
+      <w:proofErr w:type="spellEnd"/>
+      <w:r>
+        <w:rPr>
+          <w:rFonts w:ascii="Bookman Old Style" w:hAnsi="Bookman Old Style"/>
+          <w:sz w:val="24"/>
+          <w:szCs w:val="24"/>
+        </w:rPr>
+        <w:t xml:space="preserve"> </w:t>
+      </w:r>
+      <w:proofErr w:type="spellStart"/>
+      <w:r>
+        <w:rPr>
+          <w:rFonts w:ascii="Bookman Old Style" w:hAnsi="Bookman Old Style"/>
+          <w:sz w:val="24"/>
+          <w:szCs w:val="24"/>
+        </w:rPr>
+        <w:t>dimaksud</w:t>
+      </w:r>
+      <w:proofErr w:type="spellEnd"/>
+      <w:r>
+        <w:rPr>
+          <w:rFonts w:ascii="Bookman Old Style" w:hAnsi="Bookman Old Style"/>
+          <w:sz w:val="24"/>
+          <w:szCs w:val="24"/>
+        </w:rPr>
+        <w:t xml:space="preserve"> pada </w:t>
+      </w:r>
+      <w:proofErr w:type="spellStart"/>
+      <w:r>
+        <w:rPr>
+          <w:rFonts w:ascii="Bookman Old Style" w:hAnsi="Bookman Old Style"/>
+          <w:sz w:val="24"/>
+          <w:szCs w:val="24"/>
+        </w:rPr>
+        <w:t>ayat</w:t>
+      </w:r>
+      <w:proofErr w:type="spellEnd"/>
+      <w:r>
+        <w:rPr>
+          <w:rFonts w:ascii="Bookman Old Style" w:hAnsi="Bookman Old Style"/>
+          <w:sz w:val="24"/>
+          <w:szCs w:val="24"/>
+        </w:rPr>
+        <w:t xml:space="preserve"> (1) </w:t>
+      </w:r>
+      <w:proofErr w:type="spellStart"/>
+      <w:proofErr w:type="gramStart"/>
+      <w:r>
+        <w:rPr>
+          <w:rFonts w:ascii="Bookman Old Style" w:hAnsi="Bookman Old Style"/>
+          <w:sz w:val="24"/>
+          <w:szCs w:val="24"/>
+        </w:rPr>
+        <w:t>meliputi</w:t>
+      </w:r>
+      <w:proofErr w:type="spellEnd"/>
+      <w:r>
+        <w:rPr>
+          <w:rFonts w:ascii="Bookman Old Style" w:hAnsi="Bookman Old Style"/>
+          <w:sz w:val="24"/>
+          <w:szCs w:val="24"/>
+        </w:rPr>
+        <w:t xml:space="preserve"> :</w:t>
+      </w:r>
+      <w:proofErr w:type="gramEnd"/>
     </w:p>
     <w:p>
       <w:pPr>
@@ -1754,7 +2465,151 @@
           <w:sz w:val="24"/>
           <w:szCs w:val="24"/>
         </w:rPr>
-        <w:t>Setia dan taat pada Pancasila, Undang-Undang Dasar Negara Republik Indonesia Tahun 1945, Negara Kesatuan Republik Indonesia, dan Pemerintah yang sah;</w:t>
+        <w:t xml:space="preserve">Setia dan </w:t>
+      </w:r>
+      <w:proofErr w:type="spellStart"/>
+      <w:r>
+        <w:rPr>
+          <w:rFonts w:ascii="Bookman Old Style" w:hAnsi="Bookman Old Style"/>
+          <w:sz w:val="24"/>
+          <w:szCs w:val="24"/>
+        </w:rPr>
+        <w:t>taat</w:t>
+      </w:r>
+      <w:proofErr w:type="spellEnd"/>
+      <w:r>
+        <w:rPr>
+          <w:rFonts w:ascii="Bookman Old Style" w:hAnsi="Bookman Old Style"/>
+          <w:sz w:val="24"/>
+          <w:szCs w:val="24"/>
+        </w:rPr>
+        <w:t xml:space="preserve"> pada Pancasila, </w:t>
+      </w:r>
+      <w:proofErr w:type="spellStart"/>
+      <w:r>
+        <w:rPr>
+          <w:rFonts w:ascii="Bookman Old Style" w:hAnsi="Bookman Old Style"/>
+          <w:sz w:val="24"/>
+          <w:szCs w:val="24"/>
+        </w:rPr>
+        <w:t>Undang-Undang</w:t>
+      </w:r>
+      <w:proofErr w:type="spellEnd"/>
+      <w:r>
+        <w:rPr>
+          <w:rFonts w:ascii="Bookman Old Style" w:hAnsi="Bookman Old Style"/>
+          <w:sz w:val="24"/>
+          <w:szCs w:val="24"/>
+        </w:rPr>
+        <w:t xml:space="preserve"> Dasar Negara </w:t>
+      </w:r>
+      <w:proofErr w:type="spellStart"/>
+      <w:r>
+        <w:rPr>
+          <w:rFonts w:ascii="Bookman Old Style" w:hAnsi="Bookman Old Style"/>
+          <w:sz w:val="24"/>
+          <w:szCs w:val="24"/>
+        </w:rPr>
+        <w:t>Republik</w:t>
+      </w:r>
+      <w:proofErr w:type="spellEnd"/>
+      <w:r>
+        <w:rPr>
+          <w:rFonts w:ascii="Bookman Old Style" w:hAnsi="Bookman Old Style"/>
+          <w:sz w:val="24"/>
+          <w:szCs w:val="24"/>
+        </w:rPr>
+        <w:t xml:space="preserve"> Indonesia </w:t>
+      </w:r>
+      <w:proofErr w:type="spellStart"/>
+      <w:r>
+        <w:rPr>
+          <w:rFonts w:ascii="Bookman Old Style" w:hAnsi="Bookman Old Style"/>
+          <w:sz w:val="24"/>
+          <w:szCs w:val="24"/>
+        </w:rPr>
+        <w:t>Tahun</w:t>
+      </w:r>
+      <w:proofErr w:type="spellEnd"/>
+      <w:r>
+        <w:rPr>
+          <w:rFonts w:ascii="Bookman Old Style" w:hAnsi="Bookman Old Style"/>
+          <w:sz w:val="24"/>
+          <w:szCs w:val="24"/>
+        </w:rPr>
+        <w:t xml:space="preserve"> 1945, Negara </w:t>
+      </w:r>
+      <w:proofErr w:type="spellStart"/>
+      <w:r>
+        <w:rPr>
+          <w:rFonts w:ascii="Bookman Old Style" w:hAnsi="Bookman Old Style"/>
+          <w:sz w:val="24"/>
+          <w:szCs w:val="24"/>
+        </w:rPr>
+        <w:t>Kesatuan</w:t>
+      </w:r>
+      <w:proofErr w:type="spellEnd"/>
+      <w:r>
+        <w:rPr>
+          <w:rFonts w:ascii="Bookman Old Style" w:hAnsi="Bookman Old Style"/>
+          <w:sz w:val="24"/>
+          <w:szCs w:val="24"/>
+        </w:rPr>
+        <w:t xml:space="preserve"> </w:t>
+      </w:r>
+      <w:proofErr w:type="spellStart"/>
+      <w:r>
+        <w:rPr>
+          <w:rFonts w:ascii="Bookman Old Style" w:hAnsi="Bookman Old Style"/>
+          <w:sz w:val="24"/>
+          <w:szCs w:val="24"/>
+        </w:rPr>
+        <w:t>Republik</w:t>
+      </w:r>
+      <w:proofErr w:type="spellEnd"/>
+      <w:r>
+        <w:rPr>
+          <w:rFonts w:ascii="Bookman Old Style" w:hAnsi="Bookman Old Style"/>
+          <w:sz w:val="24"/>
+          <w:szCs w:val="24"/>
+        </w:rPr>
+        <w:t xml:space="preserve"> Indonesia, dan </w:t>
+      </w:r>
+      <w:proofErr w:type="spellStart"/>
+      <w:r>
+        <w:rPr>
+          <w:rFonts w:ascii="Bookman Old Style" w:hAnsi="Bookman Old Style"/>
+          <w:sz w:val="24"/>
+          <w:szCs w:val="24"/>
+        </w:rPr>
+        <w:t>Pemerintah</w:t>
+      </w:r>
+      <w:proofErr w:type="spellEnd"/>
+      <w:r>
+        <w:rPr>
+          <w:rFonts w:ascii="Bookman Old Style" w:hAnsi="Bookman Old Style"/>
+          <w:sz w:val="24"/>
+          <w:szCs w:val="24"/>
+        </w:rPr>
+        <w:t xml:space="preserve"> yang </w:t>
+      </w:r>
+      <w:proofErr w:type="spellStart"/>
+      <w:r>
+        <w:rPr>
+          <w:rFonts w:ascii="Bookman Old Style" w:hAnsi="Bookman Old Style"/>
+          <w:sz w:val="24"/>
+          <w:szCs w:val="24"/>
+        </w:rPr>
+        <w:t>sah</w:t>
+      </w:r>
+      <w:proofErr w:type="spellEnd"/>
+      <w:r>
+        <w:rPr>
+          <w:rFonts w:ascii="Bookman Old Style" w:hAnsi="Bookman Old Style"/>
+          <w:sz w:val="24"/>
+          <w:szCs w:val="24"/>
+        </w:rPr>
+        <w:t>;</w:t>
       </w:r>
     </w:p>
     <w:p>
@@ -1986,13 +2841,95 @@
           <w:szCs w:val="24"/>
         </w:rPr>
       </w:pPr>
-      <w:r>
-        <w:rPr>
-          <w:rFonts w:ascii="Bookman Old Style" w:hAnsi="Bookman Old Style"/>
-          <w:sz w:val="24"/>
-          <w:szCs w:val="24"/>
-        </w:rPr>
-        <w:t>Bersedia ditempatkan di seluruh wilayah Negara Kesatuan Republik Indonesia.</w:t>
+      <w:proofErr w:type="spellStart"/>
+      <w:r>
+        <w:rPr>
+          <w:rFonts w:ascii="Bookman Old Style" w:hAnsi="Bookman Old Style"/>
+          <w:sz w:val="24"/>
+          <w:szCs w:val="24"/>
+        </w:rPr>
+        <w:t>Bersedia</w:t>
+      </w:r>
+      <w:proofErr w:type="spellEnd"/>
+      <w:r>
+        <w:rPr>
+          <w:rFonts w:ascii="Bookman Old Style" w:hAnsi="Bookman Old Style"/>
+          <w:sz w:val="24"/>
+          <w:szCs w:val="24"/>
+        </w:rPr>
+        <w:t xml:space="preserve"> </w:t>
+      </w:r>
+      <w:proofErr w:type="spellStart"/>
+      <w:r>
+        <w:rPr>
+          <w:rFonts w:ascii="Bookman Old Style" w:hAnsi="Bookman Old Style"/>
+          <w:sz w:val="24"/>
+          <w:szCs w:val="24"/>
+        </w:rPr>
+        <w:t>ditempatkan</w:t>
+      </w:r>
+      <w:proofErr w:type="spellEnd"/>
+      <w:r>
+        <w:rPr>
+          <w:rFonts w:ascii="Bookman Old Style" w:hAnsi="Bookman Old Style"/>
+          <w:sz w:val="24"/>
+          <w:szCs w:val="24"/>
+        </w:rPr>
+        <w:t xml:space="preserve"> di </w:t>
+      </w:r>
+      <w:proofErr w:type="spellStart"/>
+      <w:r>
+        <w:rPr>
+          <w:rFonts w:ascii="Bookman Old Style" w:hAnsi="Bookman Old Style"/>
+          <w:sz w:val="24"/>
+          <w:szCs w:val="24"/>
+        </w:rPr>
+        <w:t>seluruh</w:t>
+      </w:r>
+      <w:proofErr w:type="spellEnd"/>
+      <w:r>
+        <w:rPr>
+          <w:rFonts w:ascii="Bookman Old Style" w:hAnsi="Bookman Old Style"/>
+          <w:sz w:val="24"/>
+          <w:szCs w:val="24"/>
+        </w:rPr>
+        <w:t xml:space="preserve"> wilayah Negara </w:t>
+      </w:r>
+      <w:proofErr w:type="spellStart"/>
+      <w:r>
+        <w:rPr>
+          <w:rFonts w:ascii="Bookman Old Style" w:hAnsi="Bookman Old Style"/>
+          <w:sz w:val="24"/>
+          <w:szCs w:val="24"/>
+        </w:rPr>
+        <w:t>Kesatuan</w:t>
+      </w:r>
+      <w:proofErr w:type="spellEnd"/>
+      <w:r>
+        <w:rPr>
+          <w:rFonts w:ascii="Bookman Old Style" w:hAnsi="Bookman Old Style"/>
+          <w:sz w:val="24"/>
+          <w:szCs w:val="24"/>
+        </w:rPr>
+        <w:t xml:space="preserve"> </w:t>
+      </w:r>
+      <w:proofErr w:type="spellStart"/>
+      <w:r>
+        <w:rPr>
+          <w:rFonts w:ascii="Bookman Old Style" w:hAnsi="Bookman Old Style"/>
+          <w:sz w:val="24"/>
+          <w:szCs w:val="24"/>
+        </w:rPr>
+        <w:t>Republik</w:t>
+      </w:r>
+      <w:proofErr w:type="spellEnd"/>
+      <w:r>
+        <w:rPr>
+          <w:rFonts w:ascii="Bookman Old Style" w:hAnsi="Bookman Old Style"/>
+          <w:sz w:val="24"/>
+          <w:szCs w:val="24"/>
+        </w:rPr>
+        <w:t xml:space="preserve"> Indonesia.</w:t>
       </w:r>
     </w:p>
     <w:p>
@@ -2404,13 +3341,41 @@
           <w:szCs w:val="24"/>
         </w:rPr>
       </w:pPr>
-      <w:r>
-        <w:rPr>
-          <w:rFonts w:ascii="Bookman Old Style" w:hAnsi="Bookman Old Style"/>
-          <w:sz w:val="24"/>
-          <w:szCs w:val="24"/>
-        </w:rPr>
-        <w:t>Menyalahgunakan wewenang;</w:t>
+      <w:proofErr w:type="spellStart"/>
+      <w:r>
+        <w:rPr>
+          <w:rFonts w:ascii="Bookman Old Style" w:hAnsi="Bookman Old Style"/>
+          <w:sz w:val="24"/>
+          <w:szCs w:val="24"/>
+        </w:rPr>
+        <w:t>Menyalahgunakan</w:t>
+      </w:r>
+      <w:proofErr w:type="spellEnd"/>
+      <w:r>
+        <w:rPr>
+          <w:rFonts w:ascii="Bookman Old Style" w:hAnsi="Bookman Old Style"/>
+          <w:sz w:val="24"/>
+          <w:szCs w:val="24"/>
+        </w:rPr>
+        <w:t xml:space="preserve"> </w:t>
+      </w:r>
+      <w:proofErr w:type="spellStart"/>
+      <w:r>
+        <w:rPr>
+          <w:rFonts w:ascii="Bookman Old Style" w:hAnsi="Bookman Old Style"/>
+          <w:sz w:val="24"/>
+          <w:szCs w:val="24"/>
+        </w:rPr>
+        <w:t>wewenang</w:t>
+      </w:r>
+      <w:proofErr w:type="spellEnd"/>
+      <w:r>
+        <w:rPr>
+          <w:rFonts w:ascii="Bookman Old Style" w:hAnsi="Bookman Old Style"/>
+          <w:sz w:val="24"/>
+          <w:szCs w:val="24"/>
+        </w:rPr>
+        <w:t>;</w:t>
       </w:r>
     </w:p>
     <w:p>
@@ -2668,13 +3633,77 @@
           <w:szCs w:val="24"/>
         </w:rPr>
       </w:pPr>
-      <w:r>
-        <w:rPr>
-          <w:rFonts w:ascii="Bookman Old Style" w:hAnsi="Bookman Old Style"/>
-          <w:sz w:val="24"/>
-          <w:szCs w:val="24"/>
-        </w:rPr>
-        <w:t>Bertindak sewenang-wenang terhadap bawahannya;</w:t>
+      <w:proofErr w:type="spellStart"/>
+      <w:r>
+        <w:rPr>
+          <w:rFonts w:ascii="Bookman Old Style" w:hAnsi="Bookman Old Style"/>
+          <w:sz w:val="24"/>
+          <w:szCs w:val="24"/>
+        </w:rPr>
+        <w:t>Bertindak</w:t>
+      </w:r>
+      <w:proofErr w:type="spellEnd"/>
+      <w:r>
+        <w:rPr>
+          <w:rFonts w:ascii="Bookman Old Style" w:hAnsi="Bookman Old Style"/>
+          <w:sz w:val="24"/>
+          <w:szCs w:val="24"/>
+        </w:rPr>
+        <w:t xml:space="preserve"> </w:t>
+      </w:r>
+      <w:proofErr w:type="spellStart"/>
+      <w:r>
+        <w:rPr>
+          <w:rFonts w:ascii="Bookman Old Style" w:hAnsi="Bookman Old Style"/>
+          <w:sz w:val="24"/>
+          <w:szCs w:val="24"/>
+        </w:rPr>
+        <w:t>sewenang-wenang</w:t>
+      </w:r>
+      <w:proofErr w:type="spellEnd"/>
+      <w:r>
+        <w:rPr>
+          <w:rFonts w:ascii="Bookman Old Style" w:hAnsi="Bookman Old Style"/>
+          <w:sz w:val="24"/>
+          <w:szCs w:val="24"/>
+        </w:rPr>
+        <w:t xml:space="preserve"> </w:t>
+      </w:r>
+      <w:proofErr w:type="spellStart"/>
+      <w:r>
+        <w:rPr>
+          <w:rFonts w:ascii="Bookman Old Style" w:hAnsi="Bookman Old Style"/>
+          <w:sz w:val="24"/>
+          <w:szCs w:val="24"/>
+        </w:rPr>
+        <w:t>terhadap</w:t>
+      </w:r>
+      <w:proofErr w:type="spellEnd"/>
+      <w:r>
+        <w:rPr>
+          <w:rFonts w:ascii="Bookman Old Style" w:hAnsi="Bookman Old Style"/>
+          <w:sz w:val="24"/>
+          <w:szCs w:val="24"/>
+        </w:rPr>
+        <w:t xml:space="preserve"> </w:t>
+      </w:r>
+      <w:proofErr w:type="spellStart"/>
+      <w:r>
+        <w:rPr>
+          <w:rFonts w:ascii="Bookman Old Style" w:hAnsi="Bookman Old Style"/>
+          <w:sz w:val="24"/>
+          <w:szCs w:val="24"/>
+        </w:rPr>
+        <w:t>bawahannya</w:t>
+      </w:r>
+      <w:proofErr w:type="spellEnd"/>
+      <w:r>
+        <w:rPr>
+          <w:rFonts w:ascii="Bookman Old Style" w:hAnsi="Bookman Old Style"/>
+          <w:sz w:val="24"/>
+          <w:szCs w:val="24"/>
+        </w:rPr>
+        <w:t>;</w:t>
       </w:r>
     </w:p>
     <w:p>
@@ -2698,13 +3727,365 @@
           <w:szCs w:val="24"/>
         </w:rPr>
       </w:pPr>
-      <w:r>
-        <w:rPr>
-          <w:rFonts w:ascii="Bookman Old Style" w:hAnsi="Bookman Old Style"/>
-          <w:sz w:val="24"/>
-          <w:szCs w:val="24"/>
-        </w:rPr>
-        <w:t>Melakukan suatu tindakan atau tidak melakukan suatu tindakan yang dapat menghalangi atau mempersulit salah satu pihak yang dilayani sehingga mengakibatkan kerugian bagi yang dilayani;</w:t>
+      <w:proofErr w:type="spellStart"/>
+      <w:r>
+        <w:rPr>
+          <w:rFonts w:ascii="Bookman Old Style" w:hAnsi="Bookman Old Style"/>
+          <w:sz w:val="24"/>
+          <w:szCs w:val="24"/>
+        </w:rPr>
+        <w:t>Melakukan</w:t>
+      </w:r>
+      <w:proofErr w:type="spellEnd"/>
+      <w:r>
+        <w:rPr>
+          <w:rFonts w:ascii="Bookman Old Style" w:hAnsi="Bookman Old Style"/>
+          <w:sz w:val="24"/>
+          <w:szCs w:val="24"/>
+        </w:rPr>
+        <w:t xml:space="preserve"> </w:t>
+      </w:r>
+      <w:proofErr w:type="spellStart"/>
+      <w:r>
+        <w:rPr>
+          <w:rFonts w:ascii="Bookman Old Style" w:hAnsi="Bookman Old Style"/>
+          <w:sz w:val="24"/>
+          <w:szCs w:val="24"/>
+        </w:rPr>
+        <w:t>suatu</w:t>
+      </w:r>
+      <w:proofErr w:type="spellEnd"/>
+      <w:r>
+        <w:rPr>
+          <w:rFonts w:ascii="Bookman Old Style" w:hAnsi="Bookman Old Style"/>
+          <w:sz w:val="24"/>
+          <w:szCs w:val="24"/>
+        </w:rPr>
+        <w:t xml:space="preserve"> </w:t>
+      </w:r>
+      <w:proofErr w:type="spellStart"/>
+      <w:r>
+        <w:rPr>
+          <w:rFonts w:ascii="Bookman Old Style" w:hAnsi="Bookman Old Style"/>
+          <w:sz w:val="24"/>
+          <w:szCs w:val="24"/>
+        </w:rPr>
+        <w:t>tindakan</w:t>
+      </w:r>
+      <w:proofErr w:type="spellEnd"/>
+      <w:r>
+        <w:rPr>
+          <w:rFonts w:ascii="Bookman Old Style" w:hAnsi="Bookman Old Style"/>
+          <w:sz w:val="24"/>
+          <w:szCs w:val="24"/>
+        </w:rPr>
+        <w:t xml:space="preserve"> </w:t>
+      </w:r>
+      <w:proofErr w:type="spellStart"/>
+      <w:r>
+        <w:rPr>
+          <w:rFonts w:ascii="Bookman Old Style" w:hAnsi="Bookman Old Style"/>
+          <w:sz w:val="24"/>
+          <w:szCs w:val="24"/>
+        </w:rPr>
+        <w:t>atau</w:t>
+      </w:r>
+      <w:proofErr w:type="spellEnd"/>
+      <w:r>
+        <w:rPr>
+          <w:rFonts w:ascii="Bookman Old Style" w:hAnsi="Bookman Old Style"/>
+          <w:sz w:val="24"/>
+          <w:szCs w:val="24"/>
+        </w:rPr>
+        <w:t xml:space="preserve"> </w:t>
+      </w:r>
+      <w:proofErr w:type="spellStart"/>
+      <w:r>
+        <w:rPr>
+          <w:rFonts w:ascii="Bookman Old Style" w:hAnsi="Bookman Old Style"/>
+          <w:sz w:val="24"/>
+          <w:szCs w:val="24"/>
+        </w:rPr>
+        <w:t>tidak</w:t>
+      </w:r>
+      <w:proofErr w:type="spellEnd"/>
+      <w:r>
+        <w:rPr>
+          <w:rFonts w:ascii="Bookman Old Style" w:hAnsi="Bookman Old Style"/>
+          <w:sz w:val="24"/>
+          <w:szCs w:val="24"/>
+        </w:rPr>
+        <w:t xml:space="preserve"> </w:t>
+      </w:r>
+      <w:proofErr w:type="spellStart"/>
+      <w:r>
+        <w:rPr>
+          <w:rFonts w:ascii="Bookman Old Style" w:hAnsi="Bookman Old Style"/>
+          <w:sz w:val="24"/>
+          <w:szCs w:val="24"/>
+        </w:rPr>
+        <w:t>melakukan</w:t>
+      </w:r>
+      <w:proofErr w:type="spellEnd"/>
+      <w:r>
+        <w:rPr>
+          <w:rFonts w:ascii="Bookman Old Style" w:hAnsi="Bookman Old Style"/>
+          <w:sz w:val="24"/>
+          <w:szCs w:val="24"/>
+        </w:rPr>
+        <w:t xml:space="preserve"> </w:t>
+      </w:r>
+      <w:proofErr w:type="spellStart"/>
+      <w:r>
+        <w:rPr>
+          <w:rFonts w:ascii="Bookman Old Style" w:hAnsi="Bookman Old Style"/>
+          <w:sz w:val="24"/>
+          <w:szCs w:val="24"/>
+        </w:rPr>
+        <w:t>suatu</w:t>
+      </w:r>
+      <w:proofErr w:type="spellEnd"/>
+      <w:r>
+        <w:rPr>
+          <w:rFonts w:ascii="Bookman Old Style" w:hAnsi="Bookman Old Style"/>
+          <w:sz w:val="24"/>
+          <w:szCs w:val="24"/>
+        </w:rPr>
+        <w:t xml:space="preserve"> </w:t>
+      </w:r>
+      <w:proofErr w:type="spellStart"/>
+      <w:r>
+        <w:rPr>
+          <w:rFonts w:ascii="Bookman Old Style" w:hAnsi="Bookman Old Style"/>
+          <w:sz w:val="24"/>
+          <w:szCs w:val="24"/>
+        </w:rPr>
+        <w:t>tindakan</w:t>
+      </w:r>
+      <w:proofErr w:type="spellEnd"/>
+      <w:r>
+        <w:rPr>
+          <w:rFonts w:ascii="Bookman Old Style" w:hAnsi="Bookman Old Style"/>
+          <w:sz w:val="24"/>
+          <w:szCs w:val="24"/>
+        </w:rPr>
+        <w:t xml:space="preserve"> yang </w:t>
+      </w:r>
+      <w:proofErr w:type="spellStart"/>
+      <w:r>
+        <w:rPr>
+          <w:rFonts w:ascii="Bookman Old Style" w:hAnsi="Bookman Old Style"/>
+          <w:sz w:val="24"/>
+          <w:szCs w:val="24"/>
+        </w:rPr>
+        <w:t>dapat</w:t>
+      </w:r>
+      <w:proofErr w:type="spellEnd"/>
+      <w:r>
+        <w:rPr>
+          <w:rFonts w:ascii="Bookman Old Style" w:hAnsi="Bookman Old Style"/>
+          <w:sz w:val="24"/>
+          <w:szCs w:val="24"/>
+        </w:rPr>
+        <w:t xml:space="preserve"> </w:t>
+      </w:r>
+      <w:proofErr w:type="spellStart"/>
+      <w:r>
+        <w:rPr>
+          <w:rFonts w:ascii="Bookman Old Style" w:hAnsi="Bookman Old Style"/>
+          <w:sz w:val="24"/>
+          <w:szCs w:val="24"/>
+        </w:rPr>
+        <w:t>menghalangi</w:t>
+      </w:r>
+      <w:proofErr w:type="spellEnd"/>
+      <w:r>
+        <w:rPr>
+          <w:rFonts w:ascii="Bookman Old Style" w:hAnsi="Bookman Old Style"/>
+          <w:sz w:val="24"/>
+          <w:szCs w:val="24"/>
+        </w:rPr>
+        <w:t xml:space="preserve"> </w:t>
+      </w:r>
+      <w:proofErr w:type="spellStart"/>
+      <w:r>
+        <w:rPr>
+          <w:rFonts w:ascii="Bookman Old Style" w:hAnsi="Bookman Old Style"/>
+          <w:sz w:val="24"/>
+          <w:szCs w:val="24"/>
+        </w:rPr>
+        <w:t>atau</w:t>
+      </w:r>
+      <w:proofErr w:type="spellEnd"/>
+      <w:r>
+        <w:rPr>
+          <w:rFonts w:ascii="Bookman Old Style" w:hAnsi="Bookman Old Style"/>
+          <w:sz w:val="24"/>
+          <w:szCs w:val="24"/>
+        </w:rPr>
+        <w:t xml:space="preserve"> </w:t>
+      </w:r>
+      <w:proofErr w:type="spellStart"/>
+      <w:r>
+        <w:rPr>
+          <w:rFonts w:ascii="Bookman Old Style" w:hAnsi="Bookman Old Style"/>
+          <w:sz w:val="24"/>
+          <w:szCs w:val="24"/>
+        </w:rPr>
+        <w:t>mempersulit</w:t>
+      </w:r>
+      <w:proofErr w:type="spellEnd"/>
+      <w:r>
+        <w:rPr>
+          <w:rFonts w:ascii="Bookman Old Style" w:hAnsi="Bookman Old Style"/>
+          <w:sz w:val="24"/>
+          <w:szCs w:val="24"/>
+        </w:rPr>
+        <w:t xml:space="preserve"> salah </w:t>
+      </w:r>
+      <w:proofErr w:type="spellStart"/>
+      <w:r>
+        <w:rPr>
+          <w:rFonts w:ascii="Bookman Old Style" w:hAnsi="Bookman Old Style"/>
+          <w:sz w:val="24"/>
+          <w:szCs w:val="24"/>
+        </w:rPr>
+        <w:t>satu</w:t>
+      </w:r>
+      <w:proofErr w:type="spellEnd"/>
+      <w:r>
+        <w:rPr>
+          <w:rFonts w:ascii="Bookman Old Style" w:hAnsi="Bookman Old Style"/>
+          <w:sz w:val="24"/>
+          <w:szCs w:val="24"/>
+        </w:rPr>
+        <w:t xml:space="preserve"> </w:t>
+      </w:r>
+      <w:proofErr w:type="spellStart"/>
+      <w:r>
+        <w:rPr>
+          <w:rFonts w:ascii="Bookman Old Style" w:hAnsi="Bookman Old Style"/>
+          <w:sz w:val="24"/>
+          <w:szCs w:val="24"/>
+        </w:rPr>
+        <w:t>pihak</w:t>
+      </w:r>
+      <w:proofErr w:type="spellEnd"/>
+      <w:r>
+        <w:rPr>
+          <w:rFonts w:ascii="Bookman Old Style" w:hAnsi="Bookman Old Style"/>
+          <w:sz w:val="24"/>
+          <w:szCs w:val="24"/>
+        </w:rPr>
+        <w:t xml:space="preserve"> yang </w:t>
+      </w:r>
+      <w:proofErr w:type="spellStart"/>
+      <w:r>
+        <w:rPr>
+          <w:rFonts w:ascii="Bookman Old Style" w:hAnsi="Bookman Old Style"/>
+          <w:sz w:val="24"/>
+          <w:szCs w:val="24"/>
+        </w:rPr>
+        <w:t>dilayani</w:t>
+      </w:r>
+      <w:proofErr w:type="spellEnd"/>
+      <w:r>
+        <w:rPr>
+          <w:rFonts w:ascii="Bookman Old Style" w:hAnsi="Bookman Old Style"/>
+          <w:sz w:val="24"/>
+          <w:szCs w:val="24"/>
+        </w:rPr>
+        <w:t xml:space="preserve"> </w:t>
+      </w:r>
+      <w:proofErr w:type="spellStart"/>
+      <w:r>
+        <w:rPr>
+          <w:rFonts w:ascii="Bookman Old Style" w:hAnsi="Bookman Old Style"/>
+          <w:sz w:val="24"/>
+          <w:szCs w:val="24"/>
+        </w:rPr>
+        <w:t>sehingga</w:t>
+      </w:r>
+      <w:proofErr w:type="spellEnd"/>
+      <w:r>
+        <w:rPr>
+          <w:rFonts w:ascii="Bookman Old Style" w:hAnsi="Bookman Old Style"/>
+          <w:sz w:val="24"/>
+          <w:szCs w:val="24"/>
+        </w:rPr>
+        <w:t xml:space="preserve"> </w:t>
+      </w:r>
+      <w:proofErr w:type="spellStart"/>
+      <w:r>
+        <w:rPr>
+          <w:rFonts w:ascii="Bookman Old Style" w:hAnsi="Bookman Old Style"/>
+          <w:sz w:val="24"/>
+          <w:szCs w:val="24"/>
+        </w:rPr>
+        <w:t>mengakibatkan</w:t>
+      </w:r>
+      <w:proofErr w:type="spellEnd"/>
+      <w:r>
+        <w:rPr>
+          <w:rFonts w:ascii="Bookman Old Style" w:hAnsi="Bookman Old Style"/>
+          <w:sz w:val="24"/>
+          <w:szCs w:val="24"/>
+        </w:rPr>
+        <w:t xml:space="preserve"> </w:t>
+      </w:r>
+      <w:proofErr w:type="spellStart"/>
+      <w:r>
+        <w:rPr>
+          <w:rFonts w:ascii="Bookman Old Style" w:hAnsi="Bookman Old Style"/>
+          <w:sz w:val="24"/>
+          <w:szCs w:val="24"/>
+        </w:rPr>
+        <w:t>kerugian</w:t>
+      </w:r>
+      <w:proofErr w:type="spellEnd"/>
+      <w:r>
+        <w:rPr>
+          <w:rFonts w:ascii="Bookman Old Style" w:hAnsi="Bookman Old Style"/>
+          <w:sz w:val="24"/>
+          <w:szCs w:val="24"/>
+        </w:rPr>
+        <w:t xml:space="preserve"> </w:t>
+      </w:r>
+      <w:proofErr w:type="spellStart"/>
+      <w:r>
+        <w:rPr>
+          <w:rFonts w:ascii="Bookman Old Style" w:hAnsi="Bookman Old Style"/>
+          <w:sz w:val="24"/>
+          <w:szCs w:val="24"/>
+        </w:rPr>
+        <w:t>bagi</w:t>
+      </w:r>
+      <w:proofErr w:type="spellEnd"/>
+      <w:r>
+        <w:rPr>
+          <w:rFonts w:ascii="Bookman Old Style" w:hAnsi="Bookman Old Style"/>
+          <w:sz w:val="24"/>
+          <w:szCs w:val="24"/>
+        </w:rPr>
+        <w:t xml:space="preserve"> yang </w:t>
+      </w:r>
+      <w:proofErr w:type="spellStart"/>
+      <w:r>
+        <w:rPr>
+          <w:rFonts w:ascii="Bookman Old Style" w:hAnsi="Bookman Old Style"/>
+          <w:sz w:val="24"/>
+          <w:szCs w:val="24"/>
+        </w:rPr>
+        <w:t>dilayani</w:t>
+      </w:r>
+      <w:proofErr w:type="spellEnd"/>
+      <w:r>
+        <w:rPr>
+          <w:rFonts w:ascii="Bookman Old Style" w:hAnsi="Bookman Old Style"/>
+          <w:sz w:val="24"/>
+          <w:szCs w:val="24"/>
+        </w:rPr>
+        <w:t>;</w:t>
       </w:r>
     </w:p>
     <w:p>
@@ -2728,13 +4109,77 @@
           <w:szCs w:val="24"/>
         </w:rPr>
       </w:pPr>
-      <w:r>
-        <w:rPr>
-          <w:rFonts w:ascii="Bookman Old Style" w:hAnsi="Bookman Old Style"/>
-          <w:sz w:val="24"/>
-          <w:szCs w:val="24"/>
-        </w:rPr>
-        <w:t>Menghalangi berjalannya tugas kedinasan;</w:t>
+      <w:proofErr w:type="spellStart"/>
+      <w:r>
+        <w:rPr>
+          <w:rFonts w:ascii="Bookman Old Style" w:hAnsi="Bookman Old Style"/>
+          <w:sz w:val="24"/>
+          <w:szCs w:val="24"/>
+        </w:rPr>
+        <w:t>Menghalangi</w:t>
+      </w:r>
+      <w:proofErr w:type="spellEnd"/>
+      <w:r>
+        <w:rPr>
+          <w:rFonts w:ascii="Bookman Old Style" w:hAnsi="Bookman Old Style"/>
+          <w:sz w:val="24"/>
+          <w:szCs w:val="24"/>
+        </w:rPr>
+        <w:t xml:space="preserve"> </w:t>
+      </w:r>
+      <w:proofErr w:type="spellStart"/>
+      <w:r>
+        <w:rPr>
+          <w:rFonts w:ascii="Bookman Old Style" w:hAnsi="Bookman Old Style"/>
+          <w:sz w:val="24"/>
+          <w:szCs w:val="24"/>
+        </w:rPr>
+        <w:t>berjalannya</w:t>
+      </w:r>
+      <w:proofErr w:type="spellEnd"/>
+      <w:r>
+        <w:rPr>
+          <w:rFonts w:ascii="Bookman Old Style" w:hAnsi="Bookman Old Style"/>
+          <w:sz w:val="24"/>
+          <w:szCs w:val="24"/>
+        </w:rPr>
+        <w:t xml:space="preserve"> </w:t>
+      </w:r>
+      <w:proofErr w:type="spellStart"/>
+      <w:r>
+        <w:rPr>
+          <w:rFonts w:ascii="Bookman Old Style" w:hAnsi="Bookman Old Style"/>
+          <w:sz w:val="24"/>
+          <w:szCs w:val="24"/>
+        </w:rPr>
+        <w:t>tugas</w:t>
+      </w:r>
+      <w:proofErr w:type="spellEnd"/>
+      <w:r>
+        <w:rPr>
+          <w:rFonts w:ascii="Bookman Old Style" w:hAnsi="Bookman Old Style"/>
+          <w:sz w:val="24"/>
+          <w:szCs w:val="24"/>
+        </w:rPr>
+        <w:t xml:space="preserve"> </w:t>
+      </w:r>
+      <w:proofErr w:type="spellStart"/>
+      <w:r>
+        <w:rPr>
+          <w:rFonts w:ascii="Bookman Old Style" w:hAnsi="Bookman Old Style"/>
+          <w:sz w:val="24"/>
+          <w:szCs w:val="24"/>
+        </w:rPr>
+        <w:t>kedinasan</w:t>
+      </w:r>
+      <w:proofErr w:type="spellEnd"/>
+      <w:r>
+        <w:rPr>
+          <w:rFonts w:ascii="Bookman Old Style" w:hAnsi="Bookman Old Style"/>
+          <w:sz w:val="24"/>
+          <w:szCs w:val="24"/>
+        </w:rPr>
+        <w:t>;</w:t>
       </w:r>
     </w:p>
     <w:p>
@@ -2758,13 +4203,221 @@
           <w:szCs w:val="24"/>
         </w:rPr>
       </w:pPr>
-      <w:r>
-        <w:rPr>
-          <w:rFonts w:ascii="Bookman Old Style" w:hAnsi="Bookman Old Style"/>
-          <w:sz w:val="24"/>
-          <w:szCs w:val="24"/>
-        </w:rPr>
-        <w:t>Memberikan dukungan kepada calon Presiden/Wakil Presiden, Dewan Perwakilan Rakyat, Dewan Perwakilan Daerah, atau Dewan Perwakilan Rakyat Daerah dengan cara :</w:t>
+      <w:proofErr w:type="spellStart"/>
+      <w:r>
+        <w:rPr>
+          <w:rFonts w:ascii="Bookman Old Style" w:hAnsi="Bookman Old Style"/>
+          <w:sz w:val="24"/>
+          <w:szCs w:val="24"/>
+        </w:rPr>
+        <w:t>Memberikan</w:t>
+      </w:r>
+      <w:proofErr w:type="spellEnd"/>
+      <w:r>
+        <w:rPr>
+          <w:rFonts w:ascii="Bookman Old Style" w:hAnsi="Bookman Old Style"/>
+          <w:sz w:val="24"/>
+          <w:szCs w:val="24"/>
+        </w:rPr>
+        <w:t xml:space="preserve"> </w:t>
+      </w:r>
+      <w:proofErr w:type="spellStart"/>
+      <w:r>
+        <w:rPr>
+          <w:rFonts w:ascii="Bookman Old Style" w:hAnsi="Bookman Old Style"/>
+          <w:sz w:val="24"/>
+          <w:szCs w:val="24"/>
+        </w:rPr>
+        <w:t>dukungan</w:t>
+      </w:r>
+      <w:proofErr w:type="spellEnd"/>
+      <w:r>
+        <w:rPr>
+          <w:rFonts w:ascii="Bookman Old Style" w:hAnsi="Bookman Old Style"/>
+          <w:sz w:val="24"/>
+          <w:szCs w:val="24"/>
+        </w:rPr>
+        <w:t xml:space="preserve"> </w:t>
+      </w:r>
+      <w:proofErr w:type="spellStart"/>
+      <w:r>
+        <w:rPr>
+          <w:rFonts w:ascii="Bookman Old Style" w:hAnsi="Bookman Old Style"/>
+          <w:sz w:val="24"/>
+          <w:szCs w:val="24"/>
+        </w:rPr>
+        <w:t>kepada</w:t>
+      </w:r>
+      <w:proofErr w:type="spellEnd"/>
+      <w:r>
+        <w:rPr>
+          <w:rFonts w:ascii="Bookman Old Style" w:hAnsi="Bookman Old Style"/>
+          <w:sz w:val="24"/>
+          <w:szCs w:val="24"/>
+        </w:rPr>
+        <w:t xml:space="preserve"> </w:t>
+      </w:r>
+      <w:proofErr w:type="spellStart"/>
+      <w:r>
+        <w:rPr>
+          <w:rFonts w:ascii="Bookman Old Style" w:hAnsi="Bookman Old Style"/>
+          <w:sz w:val="24"/>
+          <w:szCs w:val="24"/>
+        </w:rPr>
+        <w:t>calon</w:t>
+      </w:r>
+      <w:proofErr w:type="spellEnd"/>
+      <w:r>
+        <w:rPr>
+          <w:rFonts w:ascii="Bookman Old Style" w:hAnsi="Bookman Old Style"/>
+          <w:sz w:val="24"/>
+          <w:szCs w:val="24"/>
+        </w:rPr>
+        <w:t xml:space="preserve"> </w:t>
+      </w:r>
+      <w:proofErr w:type="spellStart"/>
+      <w:r>
+        <w:rPr>
+          <w:rFonts w:ascii="Bookman Old Style" w:hAnsi="Bookman Old Style"/>
+          <w:sz w:val="24"/>
+          <w:szCs w:val="24"/>
+        </w:rPr>
+        <w:t>Presiden</w:t>
+      </w:r>
+      <w:proofErr w:type="spellEnd"/>
+      <w:r>
+        <w:rPr>
+          <w:rFonts w:ascii="Bookman Old Style" w:hAnsi="Bookman Old Style"/>
+          <w:sz w:val="24"/>
+          <w:szCs w:val="24"/>
+        </w:rPr>
+        <w:t xml:space="preserve">/Wakil </w:t>
+      </w:r>
+      <w:proofErr w:type="spellStart"/>
+      <w:r>
+        <w:rPr>
+          <w:rFonts w:ascii="Bookman Old Style" w:hAnsi="Bookman Old Style"/>
+          <w:sz w:val="24"/>
+          <w:szCs w:val="24"/>
+        </w:rPr>
+        <w:t>Presiden</w:t>
+      </w:r>
+      <w:proofErr w:type="spellEnd"/>
+      <w:r>
+        <w:rPr>
+          <w:rFonts w:ascii="Bookman Old Style" w:hAnsi="Bookman Old Style"/>
+          <w:sz w:val="24"/>
+          <w:szCs w:val="24"/>
+        </w:rPr>
+        <w:t xml:space="preserve">, Dewan </w:t>
+      </w:r>
+      <w:proofErr w:type="spellStart"/>
+      <w:r>
+        <w:rPr>
+          <w:rFonts w:ascii="Bookman Old Style" w:hAnsi="Bookman Old Style"/>
+          <w:sz w:val="24"/>
+          <w:szCs w:val="24"/>
+        </w:rPr>
+        <w:t>Perwakilan</w:t>
+      </w:r>
+      <w:proofErr w:type="spellEnd"/>
+      <w:r>
+        <w:rPr>
+          <w:rFonts w:ascii="Bookman Old Style" w:hAnsi="Bookman Old Style"/>
+          <w:sz w:val="24"/>
+          <w:szCs w:val="24"/>
+        </w:rPr>
+        <w:t xml:space="preserve"> Rakyat, Dewan </w:t>
+      </w:r>
+      <w:proofErr w:type="spellStart"/>
+      <w:r>
+        <w:rPr>
+          <w:rFonts w:ascii="Bookman Old Style" w:hAnsi="Bookman Old Style"/>
+          <w:sz w:val="24"/>
+          <w:szCs w:val="24"/>
+        </w:rPr>
+        <w:t>Perwakilan</w:t>
+      </w:r>
+      <w:proofErr w:type="spellEnd"/>
+      <w:r>
+        <w:rPr>
+          <w:rFonts w:ascii="Bookman Old Style" w:hAnsi="Bookman Old Style"/>
+          <w:sz w:val="24"/>
+          <w:szCs w:val="24"/>
+        </w:rPr>
+        <w:t xml:space="preserve"> Daerah, </w:t>
+      </w:r>
+      <w:proofErr w:type="spellStart"/>
+      <w:r>
+        <w:rPr>
+          <w:rFonts w:ascii="Bookman Old Style" w:hAnsi="Bookman Old Style"/>
+          <w:sz w:val="24"/>
+          <w:szCs w:val="24"/>
+        </w:rPr>
+        <w:t>atau</w:t>
+      </w:r>
+      <w:proofErr w:type="spellEnd"/>
+      <w:r>
+        <w:rPr>
+          <w:rFonts w:ascii="Bookman Old Style" w:hAnsi="Bookman Old Style"/>
+          <w:sz w:val="24"/>
+          <w:szCs w:val="24"/>
+        </w:rPr>
+        <w:t xml:space="preserve"> Dewan </w:t>
+      </w:r>
+      <w:proofErr w:type="spellStart"/>
+      <w:r>
+        <w:rPr>
+          <w:rFonts w:ascii="Bookman Old Style" w:hAnsi="Bookman Old Style"/>
+          <w:sz w:val="24"/>
+          <w:szCs w:val="24"/>
+        </w:rPr>
+        <w:t>Perwakilan</w:t>
+      </w:r>
+      <w:proofErr w:type="spellEnd"/>
+      <w:r>
+        <w:rPr>
+          <w:rFonts w:ascii="Bookman Old Style" w:hAnsi="Bookman Old Style"/>
+          <w:sz w:val="24"/>
+          <w:szCs w:val="24"/>
+        </w:rPr>
+        <w:t xml:space="preserve"> Rakyat Daerah </w:t>
+      </w:r>
+      <w:proofErr w:type="spellStart"/>
+      <w:r>
+        <w:rPr>
+          <w:rFonts w:ascii="Bookman Old Style" w:hAnsi="Bookman Old Style"/>
+          <w:sz w:val="24"/>
+          <w:szCs w:val="24"/>
+        </w:rPr>
+        <w:t>dengan</w:t>
+      </w:r>
+      <w:proofErr w:type="spellEnd"/>
+      <w:r>
+        <w:rPr>
+          <w:rFonts w:ascii="Bookman Old Style" w:hAnsi="Bookman Old Style"/>
+          <w:sz w:val="24"/>
+          <w:szCs w:val="24"/>
+        </w:rPr>
+        <w:t xml:space="preserve"> </w:t>
+      </w:r>
+      <w:proofErr w:type="spellStart"/>
+      <w:r>
+        <w:rPr>
+          <w:rFonts w:ascii="Bookman Old Style" w:hAnsi="Bookman Old Style"/>
+          <w:sz w:val="24"/>
+          <w:szCs w:val="24"/>
+        </w:rPr>
+        <w:t>cara</w:t>
+      </w:r>
+      <w:proofErr w:type="spellEnd"/>
+      <w:r>
+        <w:rPr>
+          <w:rFonts w:ascii="Bookman Old Style" w:hAnsi="Bookman Old Style"/>
+          <w:sz w:val="24"/>
+          <w:szCs w:val="24"/>
+        </w:rPr>
+        <w:t xml:space="preserve"> :</w:t>
       </w:r>
     </w:p>
     <w:p>
@@ -2822,13 +4475,203 @@
           <w:szCs w:val="24"/>
         </w:rPr>
       </w:pPr>
-      <w:r>
-        <w:rPr>
-          <w:rFonts w:ascii="Bookman Old Style" w:hAnsi="Bookman Old Style"/>
-          <w:sz w:val="24"/>
-          <w:szCs w:val="24"/>
-        </w:rPr>
-        <w:t>Menjadi  peserta kampanye dengan menggunakan atribut partai atau atribut Aparatur Sipil Negara;</w:t>
+      <w:proofErr w:type="spellStart"/>
+      <w:r>
+        <w:rPr>
+          <w:rFonts w:ascii="Bookman Old Style" w:hAnsi="Bookman Old Style"/>
+          <w:sz w:val="24"/>
+          <w:szCs w:val="24"/>
+        </w:rPr>
+        <w:t>Menjadi</w:t>
+      </w:r>
+      <w:proofErr w:type="spellEnd"/>
+      <w:r>
+        <w:rPr>
+          <w:rFonts w:ascii="Bookman Old Style" w:hAnsi="Bookman Old Style"/>
+          <w:sz w:val="24"/>
+          <w:szCs w:val="24"/>
+        </w:rPr>
+        <w:t xml:space="preserve">  </w:t>
+      </w:r>
+      <w:proofErr w:type="spellStart"/>
+      <w:r>
+        <w:rPr>
+          <w:rFonts w:ascii="Bookman Old Style" w:hAnsi="Bookman Old Style"/>
+          <w:sz w:val="24"/>
+          <w:szCs w:val="24"/>
+        </w:rPr>
+        <w:t>peserta</w:t>
+      </w:r>
+      <w:proofErr w:type="spellEnd"/>
+      <w:r>
+        <w:rPr>
+          <w:rFonts w:ascii="Bookman Old Style" w:hAnsi="Bookman Old Style"/>
+          <w:sz w:val="24"/>
+          <w:szCs w:val="24"/>
+        </w:rPr>
+        <w:t xml:space="preserve"> </w:t>
+      </w:r>
+      <w:proofErr w:type="spellStart"/>
+      <w:r>
+        <w:rPr>
+          <w:rFonts w:ascii="Bookman Old Style" w:hAnsi="Bookman Old Style"/>
+          <w:sz w:val="24"/>
+          <w:szCs w:val="24"/>
+        </w:rPr>
+        <w:t>kampanye</w:t>
+      </w:r>
+      <w:proofErr w:type="spellEnd"/>
+      <w:r>
+        <w:rPr>
+          <w:rFonts w:ascii="Bookman Old Style" w:hAnsi="Bookman Old Style"/>
+          <w:sz w:val="24"/>
+          <w:szCs w:val="24"/>
+        </w:rPr>
+        <w:t xml:space="preserve"> </w:t>
+      </w:r>
+      <w:proofErr w:type="spellStart"/>
+      <w:r>
+        <w:rPr>
+          <w:rFonts w:ascii="Bookman Old Style" w:hAnsi="Bookman Old Style"/>
+          <w:sz w:val="24"/>
+          <w:szCs w:val="24"/>
+        </w:rPr>
+        <w:t>dengan</w:t>
+      </w:r>
+      <w:proofErr w:type="spellEnd"/>
+      <w:r>
+        <w:rPr>
+          <w:rFonts w:ascii="Bookman Old Style" w:hAnsi="Bookman Old Style"/>
+          <w:sz w:val="24"/>
+          <w:szCs w:val="24"/>
+        </w:rPr>
+        <w:t xml:space="preserve"> </w:t>
+      </w:r>
+      <w:proofErr w:type="spellStart"/>
+      <w:r>
+        <w:rPr>
+          <w:rFonts w:ascii="Bookman Old Style" w:hAnsi="Bookman Old Style"/>
+          <w:sz w:val="24"/>
+          <w:szCs w:val="24"/>
+        </w:rPr>
+        <w:t>menggunakan</w:t>
+      </w:r>
+      <w:proofErr w:type="spellEnd"/>
+      <w:r>
+        <w:rPr>
+          <w:rFonts w:ascii="Bookman Old Style" w:hAnsi="Bookman Old Style"/>
+          <w:sz w:val="24"/>
+          <w:szCs w:val="24"/>
+        </w:rPr>
+        <w:t xml:space="preserve"> </w:t>
+      </w:r>
+      <w:proofErr w:type="spellStart"/>
+      <w:r>
+        <w:rPr>
+          <w:rFonts w:ascii="Bookman Old Style" w:hAnsi="Bookman Old Style"/>
+          <w:sz w:val="24"/>
+          <w:szCs w:val="24"/>
+        </w:rPr>
+        <w:t>atribut</w:t>
+      </w:r>
+      <w:proofErr w:type="spellEnd"/>
+      <w:r>
+        <w:rPr>
+          <w:rFonts w:ascii="Bookman Old Style" w:hAnsi="Bookman Old Style"/>
+          <w:sz w:val="24"/>
+          <w:szCs w:val="24"/>
+        </w:rPr>
+        <w:t xml:space="preserve"> </w:t>
+      </w:r>
+      <w:proofErr w:type="spellStart"/>
+      <w:r>
+        <w:rPr>
+          <w:rFonts w:ascii="Bookman Old Style" w:hAnsi="Bookman Old Style"/>
+          <w:sz w:val="24"/>
+          <w:szCs w:val="24"/>
+        </w:rPr>
+        <w:t>partai</w:t>
+      </w:r>
+      <w:proofErr w:type="spellEnd"/>
+      <w:r>
+        <w:rPr>
+          <w:rFonts w:ascii="Bookman Old Style" w:hAnsi="Bookman Old Style"/>
+          <w:sz w:val="24"/>
+          <w:szCs w:val="24"/>
+        </w:rPr>
+        <w:t xml:space="preserve"> </w:t>
+      </w:r>
+      <w:proofErr w:type="spellStart"/>
+      <w:r>
+        <w:rPr>
+          <w:rFonts w:ascii="Bookman Old Style" w:hAnsi="Bookman Old Style"/>
+          <w:sz w:val="24"/>
+          <w:szCs w:val="24"/>
+        </w:rPr>
+        <w:t>atau</w:t>
+      </w:r>
+      <w:proofErr w:type="spellEnd"/>
+      <w:r>
+        <w:rPr>
+          <w:rFonts w:ascii="Bookman Old Style" w:hAnsi="Bookman Old Style"/>
+          <w:sz w:val="24"/>
+          <w:szCs w:val="24"/>
+        </w:rPr>
+        <w:t xml:space="preserve"> </w:t>
+      </w:r>
+      <w:proofErr w:type="spellStart"/>
+      <w:r>
+        <w:rPr>
+          <w:rFonts w:ascii="Bookman Old Style" w:hAnsi="Bookman Old Style"/>
+          <w:sz w:val="24"/>
+          <w:szCs w:val="24"/>
+        </w:rPr>
+        <w:t>atribut</w:t>
+      </w:r>
+      <w:proofErr w:type="spellEnd"/>
+      <w:r>
+        <w:rPr>
+          <w:rFonts w:ascii="Bookman Old Style" w:hAnsi="Bookman Old Style"/>
+          <w:sz w:val="24"/>
+          <w:szCs w:val="24"/>
+        </w:rPr>
+        <w:t xml:space="preserve"> </w:t>
+      </w:r>
+      <w:proofErr w:type="spellStart"/>
+      <w:r>
+        <w:rPr>
+          <w:rFonts w:ascii="Bookman Old Style" w:hAnsi="Bookman Old Style"/>
+          <w:sz w:val="24"/>
+          <w:szCs w:val="24"/>
+        </w:rPr>
+        <w:t>Aparatur</w:t>
+      </w:r>
+      <w:proofErr w:type="spellEnd"/>
+      <w:r>
+        <w:rPr>
+          <w:rFonts w:ascii="Bookman Old Style" w:hAnsi="Bookman Old Style"/>
+          <w:sz w:val="24"/>
+          <w:szCs w:val="24"/>
+        </w:rPr>
+        <w:t xml:space="preserve"> </w:t>
+      </w:r>
+      <w:proofErr w:type="spellStart"/>
+      <w:r>
+        <w:rPr>
+          <w:rFonts w:ascii="Bookman Old Style" w:hAnsi="Bookman Old Style"/>
+          <w:sz w:val="24"/>
+          <w:szCs w:val="24"/>
+        </w:rPr>
+        <w:t>Sipil</w:t>
+      </w:r>
+      <w:proofErr w:type="spellEnd"/>
+      <w:r>
+        <w:rPr>
+          <w:rFonts w:ascii="Bookman Old Style" w:hAnsi="Bookman Old Style"/>
+          <w:sz w:val="24"/>
+          <w:szCs w:val="24"/>
+        </w:rPr>
+        <w:t xml:space="preserve"> Negara;</w:t>
       </w:r>
     </w:p>
     <w:p>
@@ -3394,13 +5237,59 @@
           <w:szCs w:val="24"/>
         </w:rPr>
       </w:pPr>
-      <w:r>
-        <w:rPr>
-          <w:rFonts w:ascii="Bookman Old Style" w:hAnsi="Bookman Old Style"/>
-          <w:sz w:val="24"/>
-          <w:szCs w:val="24"/>
-        </w:rPr>
-        <w:t>Sanksi ringan berupa :</w:t>
+      <w:proofErr w:type="spellStart"/>
+      <w:r>
+        <w:rPr>
+          <w:rFonts w:ascii="Bookman Old Style" w:hAnsi="Bookman Old Style"/>
+          <w:sz w:val="24"/>
+          <w:szCs w:val="24"/>
+        </w:rPr>
+        <w:t>Sanksi</w:t>
+      </w:r>
+      <w:proofErr w:type="spellEnd"/>
+      <w:r>
+        <w:rPr>
+          <w:rFonts w:ascii="Bookman Old Style" w:hAnsi="Bookman Old Style"/>
+          <w:sz w:val="24"/>
+          <w:szCs w:val="24"/>
+        </w:rPr>
+        <w:t xml:space="preserve"> </w:t>
+      </w:r>
+      <w:proofErr w:type="spellStart"/>
+      <w:r>
+        <w:rPr>
+          <w:rFonts w:ascii="Bookman Old Style" w:hAnsi="Bookman Old Style"/>
+          <w:sz w:val="24"/>
+          <w:szCs w:val="24"/>
+        </w:rPr>
+        <w:t>ringan</w:t>
+      </w:r>
+      <w:proofErr w:type="spellEnd"/>
+      <w:r>
+        <w:rPr>
+          <w:rFonts w:ascii="Bookman Old Style" w:hAnsi="Bookman Old Style"/>
+          <w:sz w:val="24"/>
+          <w:szCs w:val="24"/>
+        </w:rPr>
+        <w:t xml:space="preserve"> </w:t>
+      </w:r>
+      <w:proofErr w:type="spellStart"/>
+      <w:r>
+        <w:rPr>
+          <w:rFonts w:ascii="Bookman Old Style" w:hAnsi="Bookman Old Style"/>
+          <w:sz w:val="24"/>
+          <w:szCs w:val="24"/>
+        </w:rPr>
+        <w:t>berupa</w:t>
+      </w:r>
+      <w:proofErr w:type="spellEnd"/>
+      <w:r>
+        <w:rPr>
+          <w:rFonts w:ascii="Bookman Old Style" w:hAnsi="Bookman Old Style"/>
+          <w:sz w:val="24"/>
+          <w:szCs w:val="24"/>
+        </w:rPr>
+        <w:t xml:space="preserve"> :</w:t>
       </w:r>
     </w:p>
     <w:p>
@@ -3423,13 +5312,41 @@
           <w:szCs w:val="24"/>
         </w:rPr>
       </w:pPr>
-      <w:r>
-        <w:rPr>
-          <w:rFonts w:ascii="Bookman Old Style" w:hAnsi="Bookman Old Style"/>
-          <w:sz w:val="24"/>
-          <w:szCs w:val="24"/>
-        </w:rPr>
-        <w:t>Teguran lisan;</w:t>
+      <w:proofErr w:type="spellStart"/>
+      <w:r>
+        <w:rPr>
+          <w:rFonts w:ascii="Bookman Old Style" w:hAnsi="Bookman Old Style"/>
+          <w:sz w:val="24"/>
+          <w:szCs w:val="24"/>
+        </w:rPr>
+        <w:t>Teguran</w:t>
+      </w:r>
+      <w:proofErr w:type="spellEnd"/>
+      <w:r>
+        <w:rPr>
+          <w:rFonts w:ascii="Bookman Old Style" w:hAnsi="Bookman Old Style"/>
+          <w:sz w:val="24"/>
+          <w:szCs w:val="24"/>
+        </w:rPr>
+        <w:t xml:space="preserve"> </w:t>
+      </w:r>
+      <w:proofErr w:type="spellStart"/>
+      <w:r>
+        <w:rPr>
+          <w:rFonts w:ascii="Bookman Old Style" w:hAnsi="Bookman Old Style"/>
+          <w:sz w:val="24"/>
+          <w:szCs w:val="24"/>
+        </w:rPr>
+        <w:t>lisan</w:t>
+      </w:r>
+      <w:proofErr w:type="spellEnd"/>
+      <w:r>
+        <w:rPr>
+          <w:rFonts w:ascii="Bookman Old Style" w:hAnsi="Bookman Old Style"/>
+          <w:sz w:val="24"/>
+          <w:szCs w:val="24"/>
+        </w:rPr>
+        <w:t>;</w:t>
       </w:r>
     </w:p>
     <w:p>
@@ -3452,22 +5369,52 @@
           <w:szCs w:val="24"/>
         </w:rPr>
       </w:pPr>
-      <w:r>
-        <w:rPr>
-          <w:rFonts w:ascii="Bookman Old Style" w:hAnsi="Bookman Old Style"/>
-          <w:sz w:val="24"/>
-          <w:szCs w:val="24"/>
-        </w:rPr>
-        <w:t>Teguran tertulis</w:t>
-      </w:r>
-      <w:r>
-        <w:rPr>
-          <w:rFonts w:ascii="Bookman Old Style" w:hAnsi="Bookman Old Style"/>
-          <w:sz w:val="24"/>
-          <w:szCs w:val="24"/>
-        </w:rPr>
-        <w:t>; atau</w:t>
-      </w:r>
+      <w:proofErr w:type="spellStart"/>
+      <w:r>
+        <w:rPr>
+          <w:rFonts w:ascii="Bookman Old Style" w:hAnsi="Bookman Old Style"/>
+          <w:sz w:val="24"/>
+          <w:szCs w:val="24"/>
+        </w:rPr>
+        <w:t>Teguran</w:t>
+      </w:r>
+      <w:proofErr w:type="spellEnd"/>
+      <w:r>
+        <w:rPr>
+          <w:rFonts w:ascii="Bookman Old Style" w:hAnsi="Bookman Old Style"/>
+          <w:sz w:val="24"/>
+          <w:szCs w:val="24"/>
+        </w:rPr>
+        <w:t xml:space="preserve"> </w:t>
+      </w:r>
+      <w:proofErr w:type="spellStart"/>
+      <w:r>
+        <w:rPr>
+          <w:rFonts w:ascii="Bookman Old Style" w:hAnsi="Bookman Old Style"/>
+          <w:sz w:val="24"/>
+          <w:szCs w:val="24"/>
+        </w:rPr>
+        <w:t>tertulis</w:t>
+      </w:r>
+      <w:proofErr w:type="spellEnd"/>
+      <w:r>
+        <w:rPr>
+          <w:rFonts w:ascii="Bookman Old Style" w:hAnsi="Bookman Old Style"/>
+          <w:sz w:val="24"/>
+          <w:szCs w:val="24"/>
+        </w:rPr>
+        <w:t xml:space="preserve">; </w:t>
+      </w:r>
+      <w:proofErr w:type="spellStart"/>
+      <w:r>
+        <w:rPr>
+          <w:rFonts w:ascii="Bookman Old Style" w:hAnsi="Bookman Old Style"/>
+          <w:sz w:val="24"/>
+          <w:szCs w:val="24"/>
+        </w:rPr>
+        <w:t>atau</w:t>
+      </w:r>
+      <w:proofErr w:type="spellEnd"/>
     </w:p>
     <w:p>
       <w:pPr>
@@ -3520,13 +5467,59 @@
           <w:szCs w:val="24"/>
         </w:rPr>
       </w:pPr>
-      <w:r>
-        <w:rPr>
-          <w:rFonts w:ascii="Bookman Old Style" w:hAnsi="Bookman Old Style"/>
-          <w:sz w:val="24"/>
-          <w:szCs w:val="24"/>
-        </w:rPr>
-        <w:t>Sanksi sedang berupa :</w:t>
+      <w:proofErr w:type="spellStart"/>
+      <w:r>
+        <w:rPr>
+          <w:rFonts w:ascii="Bookman Old Style" w:hAnsi="Bookman Old Style"/>
+          <w:sz w:val="24"/>
+          <w:szCs w:val="24"/>
+        </w:rPr>
+        <w:t>Sanksi</w:t>
+      </w:r>
+      <w:proofErr w:type="spellEnd"/>
+      <w:r>
+        <w:rPr>
+          <w:rFonts w:ascii="Bookman Old Style" w:hAnsi="Bookman Old Style"/>
+          <w:sz w:val="24"/>
+          <w:szCs w:val="24"/>
+        </w:rPr>
+        <w:t xml:space="preserve"> </w:t>
+      </w:r>
+      <w:proofErr w:type="spellStart"/>
+      <w:r>
+        <w:rPr>
+          <w:rFonts w:ascii="Bookman Old Style" w:hAnsi="Bookman Old Style"/>
+          <w:sz w:val="24"/>
+          <w:szCs w:val="24"/>
+        </w:rPr>
+        <w:t>sedang</w:t>
+      </w:r>
+      <w:proofErr w:type="spellEnd"/>
+      <w:r>
+        <w:rPr>
+          <w:rFonts w:ascii="Bookman Old Style" w:hAnsi="Bookman Old Style"/>
+          <w:sz w:val="24"/>
+          <w:szCs w:val="24"/>
+        </w:rPr>
+        <w:t xml:space="preserve"> </w:t>
+      </w:r>
+      <w:proofErr w:type="spellStart"/>
+      <w:r>
+        <w:rPr>
+          <w:rFonts w:ascii="Bookman Old Style" w:hAnsi="Bookman Old Style"/>
+          <w:sz w:val="24"/>
+          <w:szCs w:val="24"/>
+        </w:rPr>
+        <w:t>berupa</w:t>
+      </w:r>
+      <w:proofErr w:type="spellEnd"/>
+      <w:r>
+        <w:rPr>
+          <w:rFonts w:ascii="Bookman Old Style" w:hAnsi="Bookman Old Style"/>
+          <w:sz w:val="24"/>
+          <w:szCs w:val="24"/>
+        </w:rPr>
+        <w:t xml:space="preserve"> :</w:t>
       </w:r>
     </w:p>
     <w:p>
@@ -3651,13 +5644,59 @@
           <w:szCs w:val="24"/>
         </w:rPr>
       </w:pPr>
-      <w:r>
-        <w:rPr>
-          <w:rFonts w:ascii="Bookman Old Style" w:hAnsi="Bookman Old Style"/>
-          <w:sz w:val="24"/>
-          <w:szCs w:val="24"/>
-        </w:rPr>
-        <w:t>Sanksi berat berupa :</w:t>
+      <w:proofErr w:type="spellStart"/>
+      <w:r>
+        <w:rPr>
+          <w:rFonts w:ascii="Bookman Old Style" w:hAnsi="Bookman Old Style"/>
+          <w:sz w:val="24"/>
+          <w:szCs w:val="24"/>
+        </w:rPr>
+        <w:t>Sanksi</w:t>
+      </w:r>
+      <w:proofErr w:type="spellEnd"/>
+      <w:r>
+        <w:rPr>
+          <w:rFonts w:ascii="Bookman Old Style" w:hAnsi="Bookman Old Style"/>
+          <w:sz w:val="24"/>
+          <w:szCs w:val="24"/>
+        </w:rPr>
+        <w:t xml:space="preserve"> </w:t>
+      </w:r>
+      <w:proofErr w:type="spellStart"/>
+      <w:r>
+        <w:rPr>
+          <w:rFonts w:ascii="Bookman Old Style" w:hAnsi="Bookman Old Style"/>
+          <w:sz w:val="24"/>
+          <w:szCs w:val="24"/>
+        </w:rPr>
+        <w:t>berat</w:t>
+      </w:r>
+      <w:proofErr w:type="spellEnd"/>
+      <w:r>
+        <w:rPr>
+          <w:rFonts w:ascii="Bookman Old Style" w:hAnsi="Bookman Old Style"/>
+          <w:sz w:val="24"/>
+          <w:szCs w:val="24"/>
+        </w:rPr>
+        <w:t xml:space="preserve"> </w:t>
+      </w:r>
+      <w:proofErr w:type="spellStart"/>
+      <w:r>
+        <w:rPr>
+          <w:rFonts w:ascii="Bookman Old Style" w:hAnsi="Bookman Old Style"/>
+          <w:sz w:val="24"/>
+          <w:szCs w:val="24"/>
+        </w:rPr>
+        <w:t>berupa</w:t>
+      </w:r>
+      <w:proofErr w:type="spellEnd"/>
+      <w:r>
+        <w:rPr>
+          <w:rFonts w:ascii="Bookman Old Style" w:hAnsi="Bookman Old Style"/>
+          <w:sz w:val="24"/>
+          <w:szCs w:val="24"/>
+        </w:rPr>
+        <w:t xml:space="preserve"> :</w:t>
       </w:r>
     </w:p>
     <w:p>
@@ -3785,6 +5824,7 @@
           <w:szCs w:val="24"/>
         </w:rPr>
       </w:pPr>
+      <w:proofErr w:type="spellStart"/>
       <w:r>
         <w:rPr>
           <w:rFonts w:ascii="Bookman Old Style" w:hAnsi="Bookman Old Style"/>
@@ -3792,7 +5832,17 @@
           <w:sz w:val="24"/>
           <w:szCs w:val="24"/>
         </w:rPr>
-        <w:t>Pasal 6</w:t>
+        <w:t>Pasal</w:t>
+      </w:r>
+      <w:proofErr w:type="spellEnd"/>
+      <w:r>
+        <w:rPr>
+          <w:rFonts w:ascii="Bookman Old Style" w:hAnsi="Bookman Old Style"/>
+          <w:b/>
+          <w:sz w:val="24"/>
+          <w:szCs w:val="24"/>
+        </w:rPr>
+        <w:t xml:space="preserve"> 6</w:t>
       </w:r>
     </w:p>
     <w:p>
@@ -3809,6 +5859,7 @@
           <w:szCs w:val="24"/>
         </w:rPr>
       </w:pPr>
+      <w:proofErr w:type="spellStart"/>
       <w:r>
         <w:rPr>
           <w:rFonts w:ascii="Bookman Old Style" w:hAnsi="Bookman Old Style"/>
@@ -3818,6 +5869,7 @@
         </w:rPr>
         <w:t>Gaji</w:t>
       </w:r>
+      <w:proofErr w:type="spellEnd"/>
     </w:p>
     <w:p>
       <w:pPr>
@@ -4306,6 +6358,7 @@
           <w:szCs w:val="24"/>
         </w:rPr>
       </w:pPr>
+      <w:proofErr w:type="spellStart"/>
       <w:r>
         <w:rPr>
           <w:rFonts w:ascii="Bookman Old Style" w:hAnsi="Bookman Old Style"/>
@@ -4313,7 +6366,17 @@
           <w:sz w:val="24"/>
           <w:szCs w:val="24"/>
         </w:rPr>
-        <w:t>Pasal 7</w:t>
+        <w:t>Pasal</w:t>
+      </w:r>
+      <w:proofErr w:type="spellEnd"/>
+      <w:r>
+        <w:rPr>
+          <w:rFonts w:ascii="Bookman Old Style" w:hAnsi="Bookman Old Style"/>
+          <w:b/>
+          <w:sz w:val="24"/>
+          <w:szCs w:val="24"/>
+        </w:rPr>
+        <w:t xml:space="preserve"> 7</w:t>
       </w:r>
     </w:p>
     <w:p>
@@ -4329,6 +6392,7 @@
           <w:szCs w:val="24"/>
         </w:rPr>
       </w:pPr>
+      <w:proofErr w:type="spellStart"/>
       <w:r>
         <w:rPr>
           <w:rFonts w:ascii="Bookman Old Style" w:hAnsi="Bookman Old Style"/>
@@ -4338,6 +6402,7 @@
         </w:rPr>
         <w:t>Cuti</w:t>
       </w:r>
+      <w:proofErr w:type="spellEnd"/>
     </w:p>
     <w:p>
       <w:pPr>
@@ -4360,13 +6425,275 @@
           <w:szCs w:val="24"/>
         </w:rPr>
       </w:pPr>
-      <w:r>
-        <w:rPr>
-          <w:rFonts w:ascii="Bookman Old Style" w:hAnsi="Bookman Old Style"/>
-          <w:sz w:val="24"/>
-          <w:szCs w:val="24"/>
-        </w:rPr>
-        <w:t>Pihak Kedua berhak mendapatkan cuti tahunan, cuti sakit, cuti melahirkan, dan cuti bersama selama masa Perjanjian Kerja.</w:t>
+      <w:proofErr w:type="spellStart"/>
+      <w:r>
+        <w:rPr>
+          <w:rFonts w:ascii="Bookman Old Style" w:hAnsi="Bookman Old Style"/>
+          <w:sz w:val="24"/>
+          <w:szCs w:val="24"/>
+        </w:rPr>
+        <w:t>Pihak</w:t>
+      </w:r>
+      <w:proofErr w:type="spellEnd"/>
+      <w:r>
+        <w:rPr>
+          <w:rFonts w:ascii="Bookman Old Style" w:hAnsi="Bookman Old Style"/>
+          <w:sz w:val="24"/>
+          <w:szCs w:val="24"/>
+        </w:rPr>
+        <w:t xml:space="preserve"> </w:t>
+      </w:r>
+      <w:proofErr w:type="spellStart"/>
+      <w:r>
+        <w:rPr>
+          <w:rFonts w:ascii="Bookman Old Style" w:hAnsi="Bookman Old Style"/>
+          <w:sz w:val="24"/>
+          <w:szCs w:val="24"/>
+        </w:rPr>
+        <w:t>Kedua</w:t>
+      </w:r>
+      <w:proofErr w:type="spellEnd"/>
+      <w:r>
+        <w:rPr>
+          <w:rFonts w:ascii="Bookman Old Style" w:hAnsi="Bookman Old Style"/>
+          <w:sz w:val="24"/>
+          <w:szCs w:val="24"/>
+        </w:rPr>
+        <w:t xml:space="preserve"> </w:t>
+      </w:r>
+      <w:proofErr w:type="spellStart"/>
+      <w:r>
+        <w:rPr>
+          <w:rFonts w:ascii="Bookman Old Style" w:hAnsi="Bookman Old Style"/>
+          <w:sz w:val="24"/>
+          <w:szCs w:val="24"/>
+        </w:rPr>
+        <w:t>berhak</w:t>
+      </w:r>
+      <w:proofErr w:type="spellEnd"/>
+      <w:r>
+        <w:rPr>
+          <w:rFonts w:ascii="Bookman Old Style" w:hAnsi="Bookman Old Style"/>
+          <w:sz w:val="24"/>
+          <w:szCs w:val="24"/>
+        </w:rPr>
+        <w:t xml:space="preserve"> </w:t>
+      </w:r>
+      <w:proofErr w:type="spellStart"/>
+      <w:r>
+        <w:rPr>
+          <w:rFonts w:ascii="Bookman Old Style" w:hAnsi="Bookman Old Style"/>
+          <w:sz w:val="24"/>
+          <w:szCs w:val="24"/>
+        </w:rPr>
+        <w:t>mendapatkan</w:t>
+      </w:r>
+      <w:proofErr w:type="spellEnd"/>
+      <w:r>
+        <w:rPr>
+          <w:rFonts w:ascii="Bookman Old Style" w:hAnsi="Bookman Old Style"/>
+          <w:sz w:val="24"/>
+          <w:szCs w:val="24"/>
+        </w:rPr>
+        <w:t xml:space="preserve"> </w:t>
+      </w:r>
+      <w:proofErr w:type="spellStart"/>
+      <w:r>
+        <w:rPr>
+          <w:rFonts w:ascii="Bookman Old Style" w:hAnsi="Bookman Old Style"/>
+          <w:sz w:val="24"/>
+          <w:szCs w:val="24"/>
+        </w:rPr>
+        <w:t>cuti</w:t>
+      </w:r>
+      <w:proofErr w:type="spellEnd"/>
+      <w:r>
+        <w:rPr>
+          <w:rFonts w:ascii="Bookman Old Style" w:hAnsi="Bookman Old Style"/>
+          <w:sz w:val="24"/>
+          <w:szCs w:val="24"/>
+        </w:rPr>
+        <w:t xml:space="preserve"> </w:t>
+      </w:r>
+      <w:proofErr w:type="spellStart"/>
+      <w:r>
+        <w:rPr>
+          <w:rFonts w:ascii="Bookman Old Style" w:hAnsi="Bookman Old Style"/>
+          <w:sz w:val="24"/>
+          <w:szCs w:val="24"/>
+        </w:rPr>
+        <w:t>tahunan</w:t>
+      </w:r>
+      <w:proofErr w:type="spellEnd"/>
+      <w:r>
+        <w:rPr>
+          <w:rFonts w:ascii="Bookman Old Style" w:hAnsi="Bookman Old Style"/>
+          <w:sz w:val="24"/>
+          <w:szCs w:val="24"/>
+        </w:rPr>
+        <w:t xml:space="preserve">, </w:t>
+      </w:r>
+      <w:proofErr w:type="spellStart"/>
+      <w:r>
+        <w:rPr>
+          <w:rFonts w:ascii="Bookman Old Style" w:hAnsi="Bookman Old Style"/>
+          <w:sz w:val="24"/>
+          <w:szCs w:val="24"/>
+        </w:rPr>
+        <w:t>cuti</w:t>
+      </w:r>
+      <w:proofErr w:type="spellEnd"/>
+      <w:r>
+        <w:rPr>
+          <w:rFonts w:ascii="Bookman Old Style" w:hAnsi="Bookman Old Style"/>
+          <w:sz w:val="24"/>
+          <w:szCs w:val="24"/>
+        </w:rPr>
+        <w:t xml:space="preserve"> </w:t>
+      </w:r>
+      <w:proofErr w:type="spellStart"/>
+      <w:r>
+        <w:rPr>
+          <w:rFonts w:ascii="Bookman Old Style" w:hAnsi="Bookman Old Style"/>
+          <w:sz w:val="24"/>
+          <w:szCs w:val="24"/>
+        </w:rPr>
+        <w:t>sakit</w:t>
+      </w:r>
+      <w:proofErr w:type="spellEnd"/>
+      <w:r>
+        <w:rPr>
+          <w:rFonts w:ascii="Bookman Old Style" w:hAnsi="Bookman Old Style"/>
+          <w:sz w:val="24"/>
+          <w:szCs w:val="24"/>
+        </w:rPr>
+        <w:t xml:space="preserve">, </w:t>
+      </w:r>
+      <w:proofErr w:type="spellStart"/>
+      <w:r>
+        <w:rPr>
+          <w:rFonts w:ascii="Bookman Old Style" w:hAnsi="Bookman Old Style"/>
+          <w:sz w:val="24"/>
+          <w:szCs w:val="24"/>
+        </w:rPr>
+        <w:t>cuti</w:t>
+      </w:r>
+      <w:proofErr w:type="spellEnd"/>
+      <w:r>
+        <w:rPr>
+          <w:rFonts w:ascii="Bookman Old Style" w:hAnsi="Bookman Old Style"/>
+          <w:sz w:val="24"/>
+          <w:szCs w:val="24"/>
+        </w:rPr>
+        <w:t xml:space="preserve"> </w:t>
+      </w:r>
+      <w:proofErr w:type="spellStart"/>
+      <w:r>
+        <w:rPr>
+          <w:rFonts w:ascii="Bookman Old Style" w:hAnsi="Bookman Old Style"/>
+          <w:sz w:val="24"/>
+          <w:szCs w:val="24"/>
+        </w:rPr>
+        <w:t>melahirkan</w:t>
+      </w:r>
+      <w:proofErr w:type="spellEnd"/>
+      <w:r>
+        <w:rPr>
+          <w:rFonts w:ascii="Bookman Old Style" w:hAnsi="Bookman Old Style"/>
+          <w:sz w:val="24"/>
+          <w:szCs w:val="24"/>
+        </w:rPr>
+        <w:t xml:space="preserve">, dan </w:t>
+      </w:r>
+      <w:proofErr w:type="spellStart"/>
+      <w:r>
+        <w:rPr>
+          <w:rFonts w:ascii="Bookman Old Style" w:hAnsi="Bookman Old Style"/>
+          <w:sz w:val="24"/>
+          <w:szCs w:val="24"/>
+        </w:rPr>
+        <w:t>cuti</w:t>
+      </w:r>
+      <w:proofErr w:type="spellEnd"/>
+      <w:r>
+        <w:rPr>
+          <w:rFonts w:ascii="Bookman Old Style" w:hAnsi="Bookman Old Style"/>
+          <w:sz w:val="24"/>
+          <w:szCs w:val="24"/>
+        </w:rPr>
+        <w:t xml:space="preserve"> </w:t>
+      </w:r>
+      <w:proofErr w:type="spellStart"/>
+      <w:r>
+        <w:rPr>
+          <w:rFonts w:ascii="Bookman Old Style" w:hAnsi="Bookman Old Style"/>
+          <w:sz w:val="24"/>
+          <w:szCs w:val="24"/>
+        </w:rPr>
+        <w:t>bersama</w:t>
+      </w:r>
+      <w:proofErr w:type="spellEnd"/>
+      <w:r>
+        <w:rPr>
+          <w:rFonts w:ascii="Bookman Old Style" w:hAnsi="Bookman Old Style"/>
+          <w:sz w:val="24"/>
+          <w:szCs w:val="24"/>
+        </w:rPr>
+        <w:t xml:space="preserve"> </w:t>
+      </w:r>
+      <w:proofErr w:type="spellStart"/>
+      <w:r>
+        <w:rPr>
+          <w:rFonts w:ascii="Bookman Old Style" w:hAnsi="Bookman Old Style"/>
+          <w:sz w:val="24"/>
+          <w:szCs w:val="24"/>
+        </w:rPr>
+        <w:t>selama</w:t>
+      </w:r>
+      <w:proofErr w:type="spellEnd"/>
+      <w:r>
+        <w:rPr>
+          <w:rFonts w:ascii="Bookman Old Style" w:hAnsi="Bookman Old Style"/>
+          <w:sz w:val="24"/>
+          <w:szCs w:val="24"/>
+        </w:rPr>
+        <w:t xml:space="preserve"> masa </w:t>
+      </w:r>
+      <w:proofErr w:type="spellStart"/>
+      <w:r>
+        <w:rPr>
+          <w:rFonts w:ascii="Bookman Old Style" w:hAnsi="Bookman Old Style"/>
+          <w:sz w:val="24"/>
+          <w:szCs w:val="24"/>
+        </w:rPr>
+        <w:t>Perjanjian</w:t>
+      </w:r>
+      <w:proofErr w:type="spellEnd"/>
+      <w:r>
+        <w:rPr>
+          <w:rFonts w:ascii="Bookman Old Style" w:hAnsi="Bookman Old Style"/>
+          <w:sz w:val="24"/>
+          <w:szCs w:val="24"/>
+        </w:rPr>
+        <w:t xml:space="preserve"> </w:t>
+      </w:r>
+      <w:proofErr w:type="spellStart"/>
+      <w:r>
+        <w:rPr>
+          <w:rFonts w:ascii="Bookman Old Style" w:hAnsi="Bookman Old Style"/>
+          <w:sz w:val="24"/>
+          <w:szCs w:val="24"/>
+        </w:rPr>
+        <w:t>Kerja</w:t>
+      </w:r>
+      <w:proofErr w:type="spellEnd"/>
+      <w:r>
+        <w:rPr>
+          <w:rFonts w:ascii="Bookman Old Style" w:hAnsi="Bookman Old Style"/>
+          <w:sz w:val="24"/>
+          <w:szCs w:val="24"/>
+        </w:rPr>
+        <w:t>.</w:t>
       </w:r>
     </w:p>
     <w:p>
@@ -4430,6 +6757,7 @@
           <w:szCs w:val="24"/>
         </w:rPr>
       </w:pPr>
+      <w:proofErr w:type="spellStart"/>
       <w:r>
         <w:rPr>
           <w:rFonts w:ascii="Bookman Old Style" w:hAnsi="Bookman Old Style"/>
@@ -4437,7 +6765,17 @@
           <w:sz w:val="24"/>
           <w:szCs w:val="24"/>
         </w:rPr>
-        <w:t>Pasal 8</w:t>
+        <w:t>Pasal</w:t>
+      </w:r>
+      <w:proofErr w:type="spellEnd"/>
+      <w:r>
+        <w:rPr>
+          <w:rFonts w:ascii="Bookman Old Style" w:hAnsi="Bookman Old Style"/>
+          <w:b/>
+          <w:sz w:val="24"/>
+          <w:szCs w:val="24"/>
+        </w:rPr>
+        <w:t xml:space="preserve"> 8</w:t>
       </w:r>
     </w:p>
     <w:p>
@@ -4455,6 +6793,7 @@
           <w:szCs w:val="24"/>
         </w:rPr>
       </w:pPr>
+      <w:proofErr w:type="spellStart"/>
       <w:r>
         <w:rPr>
           <w:rFonts w:ascii="Bookman Old Style" w:hAnsi="Bookman Old Style"/>
@@ -4462,8 +6801,29 @@
           <w:sz w:val="24"/>
           <w:szCs w:val="24"/>
         </w:rPr>
-        <w:t>Pengembangan Kompetensi</w:t>
-      </w:r>
+        <w:t>Pengembangan</w:t>
+      </w:r>
+      <w:proofErr w:type="spellEnd"/>
+      <w:r>
+        <w:rPr>
+          <w:rFonts w:ascii="Bookman Old Style" w:hAnsi="Bookman Old Style"/>
+          <w:b/>
+          <w:sz w:val="24"/>
+          <w:szCs w:val="24"/>
+        </w:rPr>
+        <w:t xml:space="preserve"> </w:t>
+      </w:r>
+      <w:proofErr w:type="spellStart"/>
+      <w:r>
+        <w:rPr>
+          <w:rFonts w:ascii="Bookman Old Style" w:hAnsi="Bookman Old Style"/>
+          <w:b/>
+          <w:sz w:val="24"/>
+          <w:szCs w:val="24"/>
+        </w:rPr>
+        <w:t>Kompetensi</w:t>
+      </w:r>
+      <w:proofErr w:type="spellEnd"/>
     </w:p>
     <w:p>
       <w:pPr>
@@ -4486,13 +6846,401 @@
           <w:szCs w:val="24"/>
         </w:rPr>
       </w:pPr>
-      <w:r>
-        <w:rPr>
-          <w:rFonts w:ascii="Bookman Old Style" w:hAnsi="Bookman Old Style"/>
-          <w:sz w:val="24"/>
-          <w:szCs w:val="24"/>
-        </w:rPr>
-        <w:t>Pihak Kesatu memberikan pengembangan kompetensi kepada Pihak Kedua untuk mendukung pelaksanaan tugas selama masa Perjanjian Kerja dengan memperhatikan hasil penilaian kinerja Pihak Kedua.</w:t>
+      <w:proofErr w:type="spellStart"/>
+      <w:r>
+        <w:rPr>
+          <w:rFonts w:ascii="Bookman Old Style" w:hAnsi="Bookman Old Style"/>
+          <w:sz w:val="24"/>
+          <w:szCs w:val="24"/>
+        </w:rPr>
+        <w:t>Pihak</w:t>
+      </w:r>
+      <w:proofErr w:type="spellEnd"/>
+      <w:r>
+        <w:rPr>
+          <w:rFonts w:ascii="Bookman Old Style" w:hAnsi="Bookman Old Style"/>
+          <w:sz w:val="24"/>
+          <w:szCs w:val="24"/>
+        </w:rPr>
+        <w:t xml:space="preserve"> </w:t>
+      </w:r>
+      <w:proofErr w:type="spellStart"/>
+      <w:r>
+        <w:rPr>
+          <w:rFonts w:ascii="Bookman Old Style" w:hAnsi="Bookman Old Style"/>
+          <w:sz w:val="24"/>
+          <w:szCs w:val="24"/>
+        </w:rPr>
+        <w:t>Kesatu</w:t>
+      </w:r>
+      <w:proofErr w:type="spellEnd"/>
+      <w:r>
+        <w:rPr>
+          <w:rFonts w:ascii="Bookman Old Style" w:hAnsi="Bookman Old Style"/>
+          <w:sz w:val="24"/>
+          <w:szCs w:val="24"/>
+        </w:rPr>
+        <w:t xml:space="preserve"> </w:t>
+      </w:r>
+      <w:proofErr w:type="spellStart"/>
+      <w:r>
+        <w:rPr>
+          <w:rFonts w:ascii="Bookman Old Style" w:hAnsi="Bookman Old Style"/>
+          <w:sz w:val="24"/>
+          <w:szCs w:val="24"/>
+        </w:rPr>
+        <w:t>memberikan</w:t>
+      </w:r>
+      <w:proofErr w:type="spellEnd"/>
+      <w:r>
+        <w:rPr>
+          <w:rFonts w:ascii="Bookman Old Style" w:hAnsi="Bookman Old Style"/>
+          <w:sz w:val="24"/>
+          <w:szCs w:val="24"/>
+        </w:rPr>
+        <w:t xml:space="preserve"> </w:t>
+      </w:r>
+      <w:proofErr w:type="spellStart"/>
+      <w:r>
+        <w:rPr>
+          <w:rFonts w:ascii="Bookman Old Style" w:hAnsi="Bookman Old Style"/>
+          <w:sz w:val="24"/>
+          <w:szCs w:val="24"/>
+        </w:rPr>
+        <w:t>pengembangan</w:t>
+      </w:r>
+      <w:proofErr w:type="spellEnd"/>
+      <w:r>
+        <w:rPr>
+          <w:rFonts w:ascii="Bookman Old Style" w:hAnsi="Bookman Old Style"/>
+          <w:sz w:val="24"/>
+          <w:szCs w:val="24"/>
+        </w:rPr>
+        <w:t xml:space="preserve"> </w:t>
+      </w:r>
+      <w:proofErr w:type="spellStart"/>
+      <w:r>
+        <w:rPr>
+          <w:rFonts w:ascii="Bookman Old Style" w:hAnsi="Bookman Old Style"/>
+          <w:sz w:val="24"/>
+          <w:szCs w:val="24"/>
+        </w:rPr>
+        <w:t>kompetensi</w:t>
+      </w:r>
+      <w:proofErr w:type="spellEnd"/>
+      <w:r>
+        <w:rPr>
+          <w:rFonts w:ascii="Bookman Old Style" w:hAnsi="Bookman Old Style"/>
+          <w:sz w:val="24"/>
+          <w:szCs w:val="24"/>
+        </w:rPr>
+        <w:t xml:space="preserve"> </w:t>
+      </w:r>
+      <w:proofErr w:type="spellStart"/>
+      <w:r>
+        <w:rPr>
+          <w:rFonts w:ascii="Bookman Old Style" w:hAnsi="Bookman Old Style"/>
+          <w:sz w:val="24"/>
+          <w:szCs w:val="24"/>
+        </w:rPr>
+        <w:t>kepada</w:t>
+      </w:r>
+      <w:proofErr w:type="spellEnd"/>
+      <w:r>
+        <w:rPr>
+          <w:rFonts w:ascii="Bookman Old Style" w:hAnsi="Bookman Old Style"/>
+          <w:sz w:val="24"/>
+          <w:szCs w:val="24"/>
+        </w:rPr>
+        <w:t xml:space="preserve"> </w:t>
+      </w:r>
+      <w:proofErr w:type="spellStart"/>
+      <w:r>
+        <w:rPr>
+          <w:rFonts w:ascii="Bookman Old Style" w:hAnsi="Bookman Old Style"/>
+          <w:sz w:val="24"/>
+          <w:szCs w:val="24"/>
+        </w:rPr>
+        <w:t>Pihak</w:t>
+      </w:r>
+      <w:proofErr w:type="spellEnd"/>
+      <w:r>
+        <w:rPr>
+          <w:rFonts w:ascii="Bookman Old Style" w:hAnsi="Bookman Old Style"/>
+          <w:sz w:val="24"/>
+          <w:szCs w:val="24"/>
+        </w:rPr>
+        <w:t xml:space="preserve"> </w:t>
+      </w:r>
+      <w:proofErr w:type="spellStart"/>
+      <w:r>
+        <w:rPr>
+          <w:rFonts w:ascii="Bookman Old Style" w:hAnsi="Bookman Old Style"/>
+          <w:sz w:val="24"/>
+          <w:szCs w:val="24"/>
+        </w:rPr>
+        <w:t>Kedua</w:t>
+      </w:r>
+      <w:proofErr w:type="spellEnd"/>
+      <w:r>
+        <w:rPr>
+          <w:rFonts w:ascii="Bookman Old Style" w:hAnsi="Bookman Old Style"/>
+          <w:sz w:val="24"/>
+          <w:szCs w:val="24"/>
+        </w:rPr>
+        <w:t xml:space="preserve"> </w:t>
+      </w:r>
+      <w:proofErr w:type="spellStart"/>
+      <w:r>
+        <w:rPr>
+          <w:rFonts w:ascii="Bookman Old Style" w:hAnsi="Bookman Old Style"/>
+          <w:sz w:val="24"/>
+          <w:szCs w:val="24"/>
+        </w:rPr>
+        <w:t>untuk</w:t>
+      </w:r>
+      <w:proofErr w:type="spellEnd"/>
+      <w:r>
+        <w:rPr>
+          <w:rFonts w:ascii="Bookman Old Style" w:hAnsi="Bookman Old Style"/>
+          <w:sz w:val="24"/>
+          <w:szCs w:val="24"/>
+        </w:rPr>
+        <w:t xml:space="preserve"> </w:t>
+      </w:r>
+      <w:proofErr w:type="spellStart"/>
+      <w:r>
+        <w:rPr>
+          <w:rFonts w:ascii="Bookman Old Style" w:hAnsi="Bookman Old Style"/>
+          <w:sz w:val="24"/>
+          <w:szCs w:val="24"/>
+        </w:rPr>
+        <w:t>mendukung</w:t>
+      </w:r>
+      <w:proofErr w:type="spellEnd"/>
+      <w:r>
+        <w:rPr>
+          <w:rFonts w:ascii="Bookman Old Style" w:hAnsi="Bookman Old Style"/>
+          <w:sz w:val="24"/>
+          <w:szCs w:val="24"/>
+        </w:rPr>
+        <w:t xml:space="preserve"> </w:t>
+      </w:r>
+      <w:proofErr w:type="spellStart"/>
+      <w:r>
+        <w:rPr>
+          <w:rFonts w:ascii="Bookman Old Style" w:hAnsi="Bookman Old Style"/>
+          <w:sz w:val="24"/>
+          <w:szCs w:val="24"/>
+        </w:rPr>
+        <w:t>pelaksanaan</w:t>
+      </w:r>
+      <w:proofErr w:type="spellEnd"/>
+      <w:r>
+        <w:rPr>
+          <w:rFonts w:ascii="Bookman Old Style" w:hAnsi="Bookman Old Style"/>
+          <w:sz w:val="24"/>
+          <w:szCs w:val="24"/>
+        </w:rPr>
+        <w:t xml:space="preserve"> </w:t>
+      </w:r>
+      <w:proofErr w:type="spellStart"/>
+      <w:r>
+        <w:rPr>
+          <w:rFonts w:ascii="Bookman Old Style" w:hAnsi="Bookman Old Style"/>
+          <w:sz w:val="24"/>
+          <w:szCs w:val="24"/>
+        </w:rPr>
+        <w:t>tugas</w:t>
+      </w:r>
+      <w:proofErr w:type="spellEnd"/>
+      <w:r>
+        <w:rPr>
+          <w:rFonts w:ascii="Bookman Old Style" w:hAnsi="Bookman Old Style"/>
+          <w:sz w:val="24"/>
+          <w:szCs w:val="24"/>
+        </w:rPr>
+        <w:t xml:space="preserve"> </w:t>
+      </w:r>
+      <w:proofErr w:type="spellStart"/>
+      <w:r>
+        <w:rPr>
+          <w:rFonts w:ascii="Bookman Old Style" w:hAnsi="Bookman Old Style"/>
+          <w:sz w:val="24"/>
+          <w:szCs w:val="24"/>
+        </w:rPr>
+        <w:t>selama</w:t>
+      </w:r>
+      <w:proofErr w:type="spellEnd"/>
+      <w:r>
+        <w:rPr>
+          <w:rFonts w:ascii="Bookman Old Style" w:hAnsi="Bookman Old Style"/>
+          <w:sz w:val="24"/>
+          <w:szCs w:val="24"/>
+        </w:rPr>
+        <w:t xml:space="preserve"> masa </w:t>
+      </w:r>
+      <w:proofErr w:type="spellStart"/>
+      <w:r>
+        <w:rPr>
+          <w:rFonts w:ascii="Bookman Old Style" w:hAnsi="Bookman Old Style"/>
+          <w:sz w:val="24"/>
+          <w:szCs w:val="24"/>
+        </w:rPr>
+        <w:t>Perjanjian</w:t>
+      </w:r>
+      <w:proofErr w:type="spellEnd"/>
+      <w:r>
+        <w:rPr>
+          <w:rFonts w:ascii="Bookman Old Style" w:hAnsi="Bookman Old Style"/>
+          <w:sz w:val="24"/>
+          <w:szCs w:val="24"/>
+        </w:rPr>
+        <w:t xml:space="preserve"> </w:t>
+      </w:r>
+      <w:proofErr w:type="spellStart"/>
+      <w:r>
+        <w:rPr>
+          <w:rFonts w:ascii="Bookman Old Style" w:hAnsi="Bookman Old Style"/>
+          <w:sz w:val="24"/>
+          <w:szCs w:val="24"/>
+        </w:rPr>
+        <w:t>Kerja</w:t>
+      </w:r>
+      <w:proofErr w:type="spellEnd"/>
+      <w:r>
+        <w:rPr>
+          <w:rFonts w:ascii="Bookman Old Style" w:hAnsi="Bookman Old Style"/>
+          <w:sz w:val="24"/>
+          <w:szCs w:val="24"/>
+        </w:rPr>
+        <w:t xml:space="preserve"> </w:t>
+      </w:r>
+      <w:proofErr w:type="spellStart"/>
+      <w:r>
+        <w:rPr>
+          <w:rFonts w:ascii="Bookman Old Style" w:hAnsi="Bookman Old Style"/>
+          <w:sz w:val="24"/>
+          <w:szCs w:val="24"/>
+        </w:rPr>
+        <w:t>dengan</w:t>
+      </w:r>
+      <w:proofErr w:type="spellEnd"/>
+      <w:r>
+        <w:rPr>
+          <w:rFonts w:ascii="Bookman Old Style" w:hAnsi="Bookman Old Style"/>
+          <w:sz w:val="24"/>
+          <w:szCs w:val="24"/>
+        </w:rPr>
+        <w:t xml:space="preserve"> </w:t>
+      </w:r>
+      <w:proofErr w:type="spellStart"/>
+      <w:r>
+        <w:rPr>
+          <w:rFonts w:ascii="Bookman Old Style" w:hAnsi="Bookman Old Style"/>
+          <w:sz w:val="24"/>
+          <w:szCs w:val="24"/>
+        </w:rPr>
+        <w:t>memperhatikan</w:t>
+      </w:r>
+      <w:proofErr w:type="spellEnd"/>
+      <w:r>
+        <w:rPr>
+          <w:rFonts w:ascii="Bookman Old Style" w:hAnsi="Bookman Old Style"/>
+          <w:sz w:val="24"/>
+          <w:szCs w:val="24"/>
+        </w:rPr>
+        <w:t xml:space="preserve"> </w:t>
+      </w:r>
+      <w:proofErr w:type="spellStart"/>
+      <w:r>
+        <w:rPr>
+          <w:rFonts w:ascii="Bookman Old Style" w:hAnsi="Bookman Old Style"/>
+          <w:sz w:val="24"/>
+          <w:szCs w:val="24"/>
+        </w:rPr>
+        <w:t>hasil</w:t>
+      </w:r>
+      <w:proofErr w:type="spellEnd"/>
+      <w:r>
+        <w:rPr>
+          <w:rFonts w:ascii="Bookman Old Style" w:hAnsi="Bookman Old Style"/>
+          <w:sz w:val="24"/>
+          <w:szCs w:val="24"/>
+        </w:rPr>
+        <w:t xml:space="preserve"> </w:t>
+      </w:r>
+      <w:proofErr w:type="spellStart"/>
+      <w:r>
+        <w:rPr>
+          <w:rFonts w:ascii="Bookman Old Style" w:hAnsi="Bookman Old Style"/>
+          <w:sz w:val="24"/>
+          <w:szCs w:val="24"/>
+        </w:rPr>
+        <w:t>penilaian</w:t>
+      </w:r>
+      <w:proofErr w:type="spellEnd"/>
+      <w:r>
+        <w:rPr>
+          <w:rFonts w:ascii="Bookman Old Style" w:hAnsi="Bookman Old Style"/>
+          <w:sz w:val="24"/>
+          <w:szCs w:val="24"/>
+        </w:rPr>
+        <w:t xml:space="preserve"> </w:t>
+      </w:r>
+      <w:proofErr w:type="spellStart"/>
+      <w:r>
+        <w:rPr>
+          <w:rFonts w:ascii="Bookman Old Style" w:hAnsi="Bookman Old Style"/>
+          <w:sz w:val="24"/>
+          <w:szCs w:val="24"/>
+        </w:rPr>
+        <w:t>kinerja</w:t>
+      </w:r>
+      <w:proofErr w:type="spellEnd"/>
+      <w:r>
+        <w:rPr>
+          <w:rFonts w:ascii="Bookman Old Style" w:hAnsi="Bookman Old Style"/>
+          <w:sz w:val="24"/>
+          <w:szCs w:val="24"/>
+        </w:rPr>
+        <w:t xml:space="preserve"> </w:t>
+      </w:r>
+      <w:proofErr w:type="spellStart"/>
+      <w:r>
+        <w:rPr>
+          <w:rFonts w:ascii="Bookman Old Style" w:hAnsi="Bookman Old Style"/>
+          <w:sz w:val="24"/>
+          <w:szCs w:val="24"/>
+        </w:rPr>
+        <w:t>Pihak</w:t>
+      </w:r>
+      <w:proofErr w:type="spellEnd"/>
+      <w:r>
+        <w:rPr>
+          <w:rFonts w:ascii="Bookman Old Style" w:hAnsi="Bookman Old Style"/>
+          <w:sz w:val="24"/>
+          <w:szCs w:val="24"/>
+        </w:rPr>
+        <w:t xml:space="preserve"> </w:t>
+      </w:r>
+      <w:proofErr w:type="spellStart"/>
+      <w:r>
+        <w:rPr>
+          <w:rFonts w:ascii="Bookman Old Style" w:hAnsi="Bookman Old Style"/>
+          <w:sz w:val="24"/>
+          <w:szCs w:val="24"/>
+        </w:rPr>
+        <w:t>Kedua</w:t>
+      </w:r>
+      <w:proofErr w:type="spellEnd"/>
+      <w:r>
+        <w:rPr>
+          <w:rFonts w:ascii="Bookman Old Style" w:hAnsi="Bookman Old Style"/>
+          <w:sz w:val="24"/>
+          <w:szCs w:val="24"/>
+        </w:rPr>
+        <w:t>.</w:t>
       </w:r>
     </w:p>
     <w:p>
@@ -4576,6 +7324,7 @@
           <w:szCs w:val="24"/>
         </w:rPr>
       </w:pPr>
+      <w:proofErr w:type="spellStart"/>
       <w:r>
         <w:rPr>
           <w:rFonts w:ascii="Bookman Old Style" w:hAnsi="Bookman Old Style"/>
@@ -4583,7 +7332,17 @@
           <w:sz w:val="24"/>
           <w:szCs w:val="24"/>
         </w:rPr>
-        <w:t>Pasal 9</w:t>
+        <w:t>Pasal</w:t>
+      </w:r>
+      <w:proofErr w:type="spellEnd"/>
+      <w:r>
+        <w:rPr>
+          <w:rFonts w:ascii="Bookman Old Style" w:hAnsi="Bookman Old Style"/>
+          <w:b/>
+          <w:sz w:val="24"/>
+          <w:szCs w:val="24"/>
+        </w:rPr>
+        <w:t xml:space="preserve"> 9</w:t>
       </w:r>
     </w:p>
     <w:p>
@@ -4601,6 +7360,7 @@
           <w:szCs w:val="24"/>
         </w:rPr>
       </w:pPr>
+      <w:proofErr w:type="spellStart"/>
       <w:r>
         <w:rPr>
           <w:rFonts w:ascii="Bookman Old Style" w:hAnsi="Bookman Old Style"/>
@@ -4610,6 +7370,7 @@
         </w:rPr>
         <w:t>Penghargaan</w:t>
       </w:r>
+      <w:proofErr w:type="spellEnd"/>
     </w:p>
     <w:p>
       <w:pPr>
@@ -4670,7 +7431,25 @@
           <w:sz w:val="24"/>
           <w:szCs w:val="24"/>
         </w:rPr>
-        <w:t>Tanda kehormatan;</w:t>
+        <w:t xml:space="preserve">Tanda </w:t>
+      </w:r>
+      <w:proofErr w:type="spellStart"/>
+      <w:r>
+        <w:rPr>
+          <w:rFonts w:ascii="Bookman Old Style" w:hAnsi="Bookman Old Style"/>
+          <w:sz w:val="24"/>
+          <w:szCs w:val="24"/>
+        </w:rPr>
+        <w:t>kehormatan</w:t>
+      </w:r>
+      <w:proofErr w:type="spellEnd"/>
+      <w:r>
+        <w:rPr>
+          <w:rFonts w:ascii="Bookman Old Style" w:hAnsi="Bookman Old Style"/>
+          <w:sz w:val="24"/>
+          <w:szCs w:val="24"/>
+        </w:rPr>
+        <w:t>;</w:t>
       </w:r>
     </w:p>
     <w:p>
@@ -4874,6 +7653,7 @@
           <w:szCs w:val="24"/>
         </w:rPr>
       </w:pPr>
+      <w:proofErr w:type="spellStart"/>
       <w:r>
         <w:rPr>
           <w:rFonts w:ascii="Bookman Old Style" w:hAnsi="Bookman Old Style"/>
@@ -4881,7 +7661,17 @@
           <w:sz w:val="24"/>
           <w:szCs w:val="24"/>
         </w:rPr>
-        <w:t>Pasal 10</w:t>
+        <w:t>Pasal</w:t>
+      </w:r>
+      <w:proofErr w:type="spellEnd"/>
+      <w:r>
+        <w:rPr>
+          <w:rFonts w:ascii="Bookman Old Style" w:hAnsi="Bookman Old Style"/>
+          <w:b/>
+          <w:sz w:val="24"/>
+          <w:szCs w:val="24"/>
+        </w:rPr>
+        <w:t xml:space="preserve"> 10</w:t>
       </w:r>
     </w:p>
     <w:p>
@@ -4898,6 +7688,7 @@
           <w:szCs w:val="24"/>
         </w:rPr>
       </w:pPr>
+      <w:proofErr w:type="spellStart"/>
       <w:r>
         <w:rPr>
           <w:rFonts w:ascii="Bookman Old Style" w:hAnsi="Bookman Old Style"/>
@@ -4907,6 +7698,7 @@
         </w:rPr>
         <w:t>Perlindungan</w:t>
       </w:r>
+      <w:proofErr w:type="spellEnd"/>
     </w:p>
     <w:p>
       <w:pPr>
@@ -4961,13 +7753,59 @@
           <w:szCs w:val="24"/>
         </w:rPr>
       </w:pPr>
-      <w:r>
-        <w:rPr>
-          <w:rFonts w:ascii="Bookman Old Style" w:hAnsi="Bookman Old Style"/>
-          <w:sz w:val="24"/>
-          <w:szCs w:val="24"/>
-        </w:rPr>
-        <w:t>Jaminan hari tua;</w:t>
+      <w:proofErr w:type="spellStart"/>
+      <w:r>
+        <w:rPr>
+          <w:rFonts w:ascii="Bookman Old Style" w:hAnsi="Bookman Old Style"/>
+          <w:sz w:val="24"/>
+          <w:szCs w:val="24"/>
+        </w:rPr>
+        <w:t>Jaminan</w:t>
+      </w:r>
+      <w:proofErr w:type="spellEnd"/>
+      <w:r>
+        <w:rPr>
+          <w:rFonts w:ascii="Bookman Old Style" w:hAnsi="Bookman Old Style"/>
+          <w:sz w:val="24"/>
+          <w:szCs w:val="24"/>
+        </w:rPr>
+        <w:t xml:space="preserve"> </w:t>
+      </w:r>
+      <w:proofErr w:type="spellStart"/>
+      <w:r>
+        <w:rPr>
+          <w:rFonts w:ascii="Bookman Old Style" w:hAnsi="Bookman Old Style"/>
+          <w:sz w:val="24"/>
+          <w:szCs w:val="24"/>
+        </w:rPr>
+        <w:t>hari</w:t>
+      </w:r>
+      <w:proofErr w:type="spellEnd"/>
+      <w:r>
+        <w:rPr>
+          <w:rFonts w:ascii="Bookman Old Style" w:hAnsi="Bookman Old Style"/>
+          <w:sz w:val="24"/>
+          <w:szCs w:val="24"/>
+        </w:rPr>
+        <w:t xml:space="preserve"> </w:t>
+      </w:r>
+      <w:proofErr w:type="spellStart"/>
+      <w:r>
+        <w:rPr>
+          <w:rFonts w:ascii="Bookman Old Style" w:hAnsi="Bookman Old Style"/>
+          <w:sz w:val="24"/>
+          <w:szCs w:val="24"/>
+        </w:rPr>
+        <w:t>tua</w:t>
+      </w:r>
+      <w:proofErr w:type="spellEnd"/>
+      <w:r>
+        <w:rPr>
+          <w:rFonts w:ascii="Bookman Old Style" w:hAnsi="Bookman Old Style"/>
+          <w:sz w:val="24"/>
+          <w:szCs w:val="24"/>
+        </w:rPr>
+        <w:t>;</w:t>
       </w:r>
     </w:p>
     <w:p>
@@ -4991,13 +7829,41 @@
           <w:szCs w:val="24"/>
         </w:rPr>
       </w:pPr>
-      <w:r>
-        <w:rPr>
-          <w:rFonts w:ascii="Bookman Old Style" w:hAnsi="Bookman Old Style"/>
-          <w:sz w:val="24"/>
-          <w:szCs w:val="24"/>
-        </w:rPr>
-        <w:t>Jaminan kesehatan;</w:t>
+      <w:proofErr w:type="spellStart"/>
+      <w:r>
+        <w:rPr>
+          <w:rFonts w:ascii="Bookman Old Style" w:hAnsi="Bookman Old Style"/>
+          <w:sz w:val="24"/>
+          <w:szCs w:val="24"/>
+        </w:rPr>
+        <w:t>Jaminan</w:t>
+      </w:r>
+      <w:proofErr w:type="spellEnd"/>
+      <w:r>
+        <w:rPr>
+          <w:rFonts w:ascii="Bookman Old Style" w:hAnsi="Bookman Old Style"/>
+          <w:sz w:val="24"/>
+          <w:szCs w:val="24"/>
+        </w:rPr>
+        <w:t xml:space="preserve"> </w:t>
+      </w:r>
+      <w:proofErr w:type="spellStart"/>
+      <w:r>
+        <w:rPr>
+          <w:rFonts w:ascii="Bookman Old Style" w:hAnsi="Bookman Old Style"/>
+          <w:sz w:val="24"/>
+          <w:szCs w:val="24"/>
+        </w:rPr>
+        <w:t>kesehatan</w:t>
+      </w:r>
+      <w:proofErr w:type="spellEnd"/>
+      <w:r>
+        <w:rPr>
+          <w:rFonts w:ascii="Bookman Old Style" w:hAnsi="Bookman Old Style"/>
+          <w:sz w:val="24"/>
+          <w:szCs w:val="24"/>
+        </w:rPr>
+        <w:t>;</w:t>
       </w:r>
     </w:p>
     <w:p>
@@ -5021,13 +7887,59 @@
           <w:szCs w:val="24"/>
         </w:rPr>
       </w:pPr>
-      <w:r>
-        <w:rPr>
-          <w:rFonts w:ascii="Bookman Old Style" w:hAnsi="Bookman Old Style"/>
-          <w:sz w:val="24"/>
-          <w:szCs w:val="24"/>
-        </w:rPr>
-        <w:t>Jaminan kecelakaan kerja;</w:t>
+      <w:proofErr w:type="spellStart"/>
+      <w:r>
+        <w:rPr>
+          <w:rFonts w:ascii="Bookman Old Style" w:hAnsi="Bookman Old Style"/>
+          <w:sz w:val="24"/>
+          <w:szCs w:val="24"/>
+        </w:rPr>
+        <w:t>Jaminan</w:t>
+      </w:r>
+      <w:proofErr w:type="spellEnd"/>
+      <w:r>
+        <w:rPr>
+          <w:rFonts w:ascii="Bookman Old Style" w:hAnsi="Bookman Old Style"/>
+          <w:sz w:val="24"/>
+          <w:szCs w:val="24"/>
+        </w:rPr>
+        <w:t xml:space="preserve"> </w:t>
+      </w:r>
+      <w:proofErr w:type="spellStart"/>
+      <w:r>
+        <w:rPr>
+          <w:rFonts w:ascii="Bookman Old Style" w:hAnsi="Bookman Old Style"/>
+          <w:sz w:val="24"/>
+          <w:szCs w:val="24"/>
+        </w:rPr>
+        <w:t>kecelakaan</w:t>
+      </w:r>
+      <w:proofErr w:type="spellEnd"/>
+      <w:r>
+        <w:rPr>
+          <w:rFonts w:ascii="Bookman Old Style" w:hAnsi="Bookman Old Style"/>
+          <w:sz w:val="24"/>
+          <w:szCs w:val="24"/>
+        </w:rPr>
+        <w:t xml:space="preserve"> </w:t>
+      </w:r>
+      <w:proofErr w:type="spellStart"/>
+      <w:r>
+        <w:rPr>
+          <w:rFonts w:ascii="Bookman Old Style" w:hAnsi="Bookman Old Style"/>
+          <w:sz w:val="24"/>
+          <w:szCs w:val="24"/>
+        </w:rPr>
+        <w:t>kerja</w:t>
+      </w:r>
+      <w:proofErr w:type="spellEnd"/>
+      <w:r>
+        <w:rPr>
+          <w:rFonts w:ascii="Bookman Old Style" w:hAnsi="Bookman Old Style"/>
+          <w:sz w:val="24"/>
+          <w:szCs w:val="24"/>
+        </w:rPr>
+        <w:t>;</w:t>
       </w:r>
     </w:p>
     <w:p>
@@ -5051,13 +7963,41 @@
           <w:szCs w:val="24"/>
         </w:rPr>
       </w:pPr>
-      <w:r>
-        <w:rPr>
-          <w:rFonts w:ascii="Bookman Old Style" w:hAnsi="Bookman Old Style"/>
-          <w:sz w:val="24"/>
-          <w:szCs w:val="24"/>
-        </w:rPr>
-        <w:t>Jaminan kematian; dan</w:t>
+      <w:proofErr w:type="spellStart"/>
+      <w:r>
+        <w:rPr>
+          <w:rFonts w:ascii="Bookman Old Style" w:hAnsi="Bookman Old Style"/>
+          <w:sz w:val="24"/>
+          <w:szCs w:val="24"/>
+        </w:rPr>
+        <w:t>Jaminan</w:t>
+      </w:r>
+      <w:proofErr w:type="spellEnd"/>
+      <w:r>
+        <w:rPr>
+          <w:rFonts w:ascii="Bookman Old Style" w:hAnsi="Bookman Old Style"/>
+          <w:sz w:val="24"/>
+          <w:szCs w:val="24"/>
+        </w:rPr>
+        <w:t xml:space="preserve"> </w:t>
+      </w:r>
+      <w:proofErr w:type="spellStart"/>
+      <w:r>
+        <w:rPr>
+          <w:rFonts w:ascii="Bookman Old Style" w:hAnsi="Bookman Old Style"/>
+          <w:sz w:val="24"/>
+          <w:szCs w:val="24"/>
+        </w:rPr>
+        <w:t>kematian</w:t>
+      </w:r>
+      <w:proofErr w:type="spellEnd"/>
+      <w:r>
+        <w:rPr>
+          <w:rFonts w:ascii="Bookman Old Style" w:hAnsi="Bookman Old Style"/>
+          <w:sz w:val="24"/>
+          <w:szCs w:val="24"/>
+        </w:rPr>
+        <w:t>; dan</w:t>
       </w:r>
     </w:p>
     <w:p>
@@ -5081,13 +8021,32 @@
           <w:szCs w:val="24"/>
         </w:rPr>
       </w:pPr>
-      <w:r>
-        <w:rPr>
-          <w:rFonts w:ascii="Bookman Old Style" w:hAnsi="Bookman Old Style"/>
-          <w:sz w:val="24"/>
-          <w:szCs w:val="24"/>
-        </w:rPr>
-        <w:t>Bantuan h</w:t>
+      <w:proofErr w:type="spellStart"/>
+      <w:r>
+        <w:rPr>
+          <w:rFonts w:ascii="Bookman Old Style" w:hAnsi="Bookman Old Style"/>
+          <w:sz w:val="24"/>
+          <w:szCs w:val="24"/>
+        </w:rPr>
+        <w:t>Bantuan</w:t>
+      </w:r>
+      <w:proofErr w:type="spellEnd"/>
+      <w:r>
+        <w:rPr>
+          <w:rFonts w:ascii="Bookman Old Style" w:hAnsi="Bookman Old Style"/>
+          <w:sz w:val="24"/>
+          <w:szCs w:val="24"/>
+        </w:rPr>
+        <w:t xml:space="preserve"> </w:t>
+      </w:r>
+      <w:proofErr w:type="spellStart"/>
+      <w:r>
+        <w:rPr>
+          <w:rFonts w:ascii="Bookman Old Style" w:hAnsi="Bookman Old Style"/>
+          <w:sz w:val="24"/>
+          <w:szCs w:val="24"/>
+        </w:rPr>
+        <w:t>h</w:t>
       </w:r>
       <w:r>
         <w:rPr>
@@ -5103,7 +8062,16 @@
           <w:sz w:val="24"/>
           <w:szCs w:val="24"/>
         </w:rPr>
-        <w:t>kum.</w:t>
+        <w:t>kum</w:t>
+      </w:r>
+      <w:proofErr w:type="spellEnd"/>
+      <w:r>
+        <w:rPr>
+          <w:rFonts w:ascii="Bookman Old Style" w:hAnsi="Bookman Old Style"/>
+          <w:sz w:val="24"/>
+          <w:szCs w:val="24"/>
+        </w:rPr>
+        <w:t>.</w:t>
       </w:r>
     </w:p>
     <w:p>
@@ -5127,13 +8095,329 @@
           <w:szCs w:val="24"/>
         </w:rPr>
       </w:pPr>
-      <w:r>
-        <w:rPr>
-          <w:rFonts w:ascii="Bookman Old Style" w:hAnsi="Bookman Old Style"/>
-          <w:sz w:val="24"/>
-          <w:szCs w:val="24"/>
-        </w:rPr>
-        <w:t>Perlindungan sebagaimana dimaksud pada ayat (1) huruf a, huruf b, huruf c, dan huruf d dilakukan dengan mengikutsertakan Pihak Kedua dalam program sistem jaminan sosial nasional.</w:t>
+      <w:proofErr w:type="spellStart"/>
+      <w:r>
+        <w:rPr>
+          <w:rFonts w:ascii="Bookman Old Style" w:hAnsi="Bookman Old Style"/>
+          <w:sz w:val="24"/>
+          <w:szCs w:val="24"/>
+        </w:rPr>
+        <w:t>Perlindungan</w:t>
+      </w:r>
+      <w:proofErr w:type="spellEnd"/>
+      <w:r>
+        <w:rPr>
+          <w:rFonts w:ascii="Bookman Old Style" w:hAnsi="Bookman Old Style"/>
+          <w:sz w:val="24"/>
+          <w:szCs w:val="24"/>
+        </w:rPr>
+        <w:t xml:space="preserve"> </w:t>
+      </w:r>
+      <w:proofErr w:type="spellStart"/>
+      <w:r>
+        <w:rPr>
+          <w:rFonts w:ascii="Bookman Old Style" w:hAnsi="Bookman Old Style"/>
+          <w:sz w:val="24"/>
+          <w:szCs w:val="24"/>
+        </w:rPr>
+        <w:t>sebagaimana</w:t>
+      </w:r>
+      <w:proofErr w:type="spellEnd"/>
+      <w:r>
+        <w:rPr>
+          <w:rFonts w:ascii="Bookman Old Style" w:hAnsi="Bookman Old Style"/>
+          <w:sz w:val="24"/>
+          <w:szCs w:val="24"/>
+        </w:rPr>
+        <w:t xml:space="preserve"> </w:t>
+      </w:r>
+      <w:proofErr w:type="spellStart"/>
+      <w:r>
+        <w:rPr>
+          <w:rFonts w:ascii="Bookman Old Style" w:hAnsi="Bookman Old Style"/>
+          <w:sz w:val="24"/>
+          <w:szCs w:val="24"/>
+        </w:rPr>
+        <w:t>dimaksud</w:t>
+      </w:r>
+      <w:proofErr w:type="spellEnd"/>
+      <w:r>
+        <w:rPr>
+          <w:rFonts w:ascii="Bookman Old Style" w:hAnsi="Bookman Old Style"/>
+          <w:sz w:val="24"/>
+          <w:szCs w:val="24"/>
+        </w:rPr>
+        <w:t xml:space="preserve"> pada </w:t>
+      </w:r>
+      <w:proofErr w:type="spellStart"/>
+      <w:r>
+        <w:rPr>
+          <w:rFonts w:ascii="Bookman Old Style" w:hAnsi="Bookman Old Style"/>
+          <w:sz w:val="24"/>
+          <w:szCs w:val="24"/>
+        </w:rPr>
+        <w:t>ayat</w:t>
+      </w:r>
+      <w:proofErr w:type="spellEnd"/>
+      <w:r>
+        <w:rPr>
+          <w:rFonts w:ascii="Bookman Old Style" w:hAnsi="Bookman Old Style"/>
+          <w:sz w:val="24"/>
+          <w:szCs w:val="24"/>
+        </w:rPr>
+        <w:t xml:space="preserve"> (1) </w:t>
+      </w:r>
+      <w:proofErr w:type="spellStart"/>
+      <w:r>
+        <w:rPr>
+          <w:rFonts w:ascii="Bookman Old Style" w:hAnsi="Bookman Old Style"/>
+          <w:sz w:val="24"/>
+          <w:szCs w:val="24"/>
+        </w:rPr>
+        <w:t>huruf</w:t>
+      </w:r>
+      <w:proofErr w:type="spellEnd"/>
+      <w:r>
+        <w:rPr>
+          <w:rFonts w:ascii="Bookman Old Style" w:hAnsi="Bookman Old Style"/>
+          <w:sz w:val="24"/>
+          <w:szCs w:val="24"/>
+        </w:rPr>
+        <w:t xml:space="preserve"> a, </w:t>
+      </w:r>
+      <w:proofErr w:type="spellStart"/>
+      <w:r>
+        <w:rPr>
+          <w:rFonts w:ascii="Bookman Old Style" w:hAnsi="Bookman Old Style"/>
+          <w:sz w:val="24"/>
+          <w:szCs w:val="24"/>
+        </w:rPr>
+        <w:t>huruf</w:t>
+      </w:r>
+      <w:proofErr w:type="spellEnd"/>
+      <w:r>
+        <w:rPr>
+          <w:rFonts w:ascii="Bookman Old Style" w:hAnsi="Bookman Old Style"/>
+          <w:sz w:val="24"/>
+          <w:szCs w:val="24"/>
+        </w:rPr>
+        <w:t xml:space="preserve"> b, </w:t>
+      </w:r>
+      <w:proofErr w:type="spellStart"/>
+      <w:r>
+        <w:rPr>
+          <w:rFonts w:ascii="Bookman Old Style" w:hAnsi="Bookman Old Style"/>
+          <w:sz w:val="24"/>
+          <w:szCs w:val="24"/>
+        </w:rPr>
+        <w:t>huruf</w:t>
+      </w:r>
+      <w:proofErr w:type="spellEnd"/>
+      <w:r>
+        <w:rPr>
+          <w:rFonts w:ascii="Bookman Old Style" w:hAnsi="Bookman Old Style"/>
+          <w:sz w:val="24"/>
+          <w:szCs w:val="24"/>
+        </w:rPr>
+        <w:t xml:space="preserve"> c, dan </w:t>
+      </w:r>
+      <w:proofErr w:type="spellStart"/>
+      <w:r>
+        <w:rPr>
+          <w:rFonts w:ascii="Bookman Old Style" w:hAnsi="Bookman Old Style"/>
+          <w:sz w:val="24"/>
+          <w:szCs w:val="24"/>
+        </w:rPr>
+        <w:t>huruf</w:t>
+      </w:r>
+      <w:proofErr w:type="spellEnd"/>
+      <w:r>
+        <w:rPr>
+          <w:rFonts w:ascii="Bookman Old Style" w:hAnsi="Bookman Old Style"/>
+          <w:sz w:val="24"/>
+          <w:szCs w:val="24"/>
+        </w:rPr>
+        <w:t xml:space="preserve"> d </w:t>
+      </w:r>
+      <w:proofErr w:type="spellStart"/>
+      <w:r>
+        <w:rPr>
+          <w:rFonts w:ascii="Bookman Old Style" w:hAnsi="Bookman Old Style"/>
+          <w:sz w:val="24"/>
+          <w:szCs w:val="24"/>
+        </w:rPr>
+        <w:t>dilakukan</w:t>
+      </w:r>
+      <w:proofErr w:type="spellEnd"/>
+      <w:r>
+        <w:rPr>
+          <w:rFonts w:ascii="Bookman Old Style" w:hAnsi="Bookman Old Style"/>
+          <w:sz w:val="24"/>
+          <w:szCs w:val="24"/>
+        </w:rPr>
+        <w:t xml:space="preserve"> </w:t>
+      </w:r>
+      <w:proofErr w:type="spellStart"/>
+      <w:r>
+        <w:rPr>
+          <w:rFonts w:ascii="Bookman Old Style" w:hAnsi="Bookman Old Style"/>
+          <w:sz w:val="24"/>
+          <w:szCs w:val="24"/>
+        </w:rPr>
+        <w:t>dengan</w:t>
+      </w:r>
+      <w:proofErr w:type="spellEnd"/>
+      <w:r>
+        <w:rPr>
+          <w:rFonts w:ascii="Bookman Old Style" w:hAnsi="Bookman Old Style"/>
+          <w:sz w:val="24"/>
+          <w:szCs w:val="24"/>
+        </w:rPr>
+        <w:t xml:space="preserve"> </w:t>
+      </w:r>
+      <w:proofErr w:type="spellStart"/>
+      <w:r>
+        <w:rPr>
+          <w:rFonts w:ascii="Bookman Old Style" w:hAnsi="Bookman Old Style"/>
+          <w:sz w:val="24"/>
+          <w:szCs w:val="24"/>
+        </w:rPr>
+        <w:t>mengikutsertakan</w:t>
+      </w:r>
+      <w:proofErr w:type="spellEnd"/>
+      <w:r>
+        <w:rPr>
+          <w:rFonts w:ascii="Bookman Old Style" w:hAnsi="Bookman Old Style"/>
+          <w:sz w:val="24"/>
+          <w:szCs w:val="24"/>
+        </w:rPr>
+        <w:t xml:space="preserve"> </w:t>
+      </w:r>
+      <w:proofErr w:type="spellStart"/>
+      <w:r>
+        <w:rPr>
+          <w:rFonts w:ascii="Bookman Old Style" w:hAnsi="Bookman Old Style"/>
+          <w:sz w:val="24"/>
+          <w:szCs w:val="24"/>
+        </w:rPr>
+        <w:t>Pihak</w:t>
+      </w:r>
+      <w:proofErr w:type="spellEnd"/>
+      <w:r>
+        <w:rPr>
+          <w:rFonts w:ascii="Bookman Old Style" w:hAnsi="Bookman Old Style"/>
+          <w:sz w:val="24"/>
+          <w:szCs w:val="24"/>
+        </w:rPr>
+        <w:t xml:space="preserve"> </w:t>
+      </w:r>
+      <w:proofErr w:type="spellStart"/>
+      <w:r>
+        <w:rPr>
+          <w:rFonts w:ascii="Bookman Old Style" w:hAnsi="Bookman Old Style"/>
+          <w:sz w:val="24"/>
+          <w:szCs w:val="24"/>
+        </w:rPr>
+        <w:t>Kedua</w:t>
+      </w:r>
+      <w:proofErr w:type="spellEnd"/>
+      <w:r>
+        <w:rPr>
+          <w:rFonts w:ascii="Bookman Old Style" w:hAnsi="Bookman Old Style"/>
+          <w:sz w:val="24"/>
+          <w:szCs w:val="24"/>
+        </w:rPr>
+        <w:t xml:space="preserve"> </w:t>
+      </w:r>
+      <w:proofErr w:type="spellStart"/>
+      <w:r>
+        <w:rPr>
+          <w:rFonts w:ascii="Bookman Old Style" w:hAnsi="Bookman Old Style"/>
+          <w:sz w:val="24"/>
+          <w:szCs w:val="24"/>
+        </w:rPr>
+        <w:t>dalam</w:t>
+      </w:r>
+      <w:proofErr w:type="spellEnd"/>
+      <w:r>
+        <w:rPr>
+          <w:rFonts w:ascii="Bookman Old Style" w:hAnsi="Bookman Old Style"/>
+          <w:sz w:val="24"/>
+          <w:szCs w:val="24"/>
+        </w:rPr>
+        <w:t xml:space="preserve"> program </w:t>
+      </w:r>
+      <w:proofErr w:type="spellStart"/>
+      <w:r>
+        <w:rPr>
+          <w:rFonts w:ascii="Bookman Old Style" w:hAnsi="Bookman Old Style"/>
+          <w:sz w:val="24"/>
+          <w:szCs w:val="24"/>
+        </w:rPr>
+        <w:t>sistem</w:t>
+      </w:r>
+      <w:proofErr w:type="spellEnd"/>
+      <w:r>
+        <w:rPr>
+          <w:rFonts w:ascii="Bookman Old Style" w:hAnsi="Bookman Old Style"/>
+          <w:sz w:val="24"/>
+          <w:szCs w:val="24"/>
+        </w:rPr>
+        <w:t xml:space="preserve"> </w:t>
+      </w:r>
+      <w:proofErr w:type="spellStart"/>
+      <w:r>
+        <w:rPr>
+          <w:rFonts w:ascii="Bookman Old Style" w:hAnsi="Bookman Old Style"/>
+          <w:sz w:val="24"/>
+          <w:szCs w:val="24"/>
+        </w:rPr>
+        <w:t>jaminan</w:t>
+      </w:r>
+      <w:proofErr w:type="spellEnd"/>
+      <w:r>
+        <w:rPr>
+          <w:rFonts w:ascii="Bookman Old Style" w:hAnsi="Bookman Old Style"/>
+          <w:sz w:val="24"/>
+          <w:szCs w:val="24"/>
+        </w:rPr>
+        <w:t xml:space="preserve"> </w:t>
+      </w:r>
+      <w:proofErr w:type="spellStart"/>
+      <w:r>
+        <w:rPr>
+          <w:rFonts w:ascii="Bookman Old Style" w:hAnsi="Bookman Old Style"/>
+          <w:sz w:val="24"/>
+          <w:szCs w:val="24"/>
+        </w:rPr>
+        <w:t>sosial</w:t>
+      </w:r>
+      <w:proofErr w:type="spellEnd"/>
+      <w:r>
+        <w:rPr>
+          <w:rFonts w:ascii="Bookman Old Style" w:hAnsi="Bookman Old Style"/>
+          <w:sz w:val="24"/>
+          <w:szCs w:val="24"/>
+        </w:rPr>
+        <w:t xml:space="preserve"> </w:t>
+      </w:r>
+      <w:proofErr w:type="spellStart"/>
+      <w:r>
+        <w:rPr>
+          <w:rFonts w:ascii="Bookman Old Style" w:hAnsi="Bookman Old Style"/>
+          <w:sz w:val="24"/>
+          <w:szCs w:val="24"/>
+        </w:rPr>
+        <w:t>nasional</w:t>
+      </w:r>
+      <w:proofErr w:type="spellEnd"/>
+      <w:r>
+        <w:rPr>
+          <w:rFonts w:ascii="Bookman Old Style" w:hAnsi="Bookman Old Style"/>
+          <w:sz w:val="24"/>
+          <w:szCs w:val="24"/>
+        </w:rPr>
+        <w:t>.</w:t>
       </w:r>
     </w:p>
     <w:p>
@@ -5157,13 +8441,293 @@
           <w:szCs w:val="24"/>
         </w:rPr>
       </w:pPr>
-      <w:r>
-        <w:rPr>
-          <w:rFonts w:ascii="Bookman Old Style" w:hAnsi="Bookman Old Style"/>
-          <w:sz w:val="24"/>
-          <w:szCs w:val="24"/>
-        </w:rPr>
-        <w:t>Perlindungan sebagaimana dimaksud pada ayat (1) huruf e diberikan kepada Pihak Kedua dalam perkara yang dihadapi di pengadilan terkait pelaksanaan tugas.</w:t>
+      <w:proofErr w:type="spellStart"/>
+      <w:r>
+        <w:rPr>
+          <w:rFonts w:ascii="Bookman Old Style" w:hAnsi="Bookman Old Style"/>
+          <w:sz w:val="24"/>
+          <w:szCs w:val="24"/>
+        </w:rPr>
+        <w:t>Perlindungan</w:t>
+      </w:r>
+      <w:proofErr w:type="spellEnd"/>
+      <w:r>
+        <w:rPr>
+          <w:rFonts w:ascii="Bookman Old Style" w:hAnsi="Bookman Old Style"/>
+          <w:sz w:val="24"/>
+          <w:szCs w:val="24"/>
+        </w:rPr>
+        <w:t xml:space="preserve"> </w:t>
+      </w:r>
+      <w:proofErr w:type="spellStart"/>
+      <w:r>
+        <w:rPr>
+          <w:rFonts w:ascii="Bookman Old Style" w:hAnsi="Bookman Old Style"/>
+          <w:sz w:val="24"/>
+          <w:szCs w:val="24"/>
+        </w:rPr>
+        <w:t>sebagaimana</w:t>
+      </w:r>
+      <w:proofErr w:type="spellEnd"/>
+      <w:r>
+        <w:rPr>
+          <w:rFonts w:ascii="Bookman Old Style" w:hAnsi="Bookman Old Style"/>
+          <w:sz w:val="24"/>
+          <w:szCs w:val="24"/>
+        </w:rPr>
+        <w:t xml:space="preserve"> </w:t>
+      </w:r>
+      <w:proofErr w:type="spellStart"/>
+      <w:r>
+        <w:rPr>
+          <w:rFonts w:ascii="Bookman Old Style" w:hAnsi="Bookman Old Style"/>
+          <w:sz w:val="24"/>
+          <w:szCs w:val="24"/>
+        </w:rPr>
+        <w:t>dimaksud</w:t>
+      </w:r>
+      <w:proofErr w:type="spellEnd"/>
+      <w:r>
+        <w:rPr>
+          <w:rFonts w:ascii="Bookman Old Style" w:hAnsi="Bookman Old Style"/>
+          <w:sz w:val="24"/>
+          <w:szCs w:val="24"/>
+        </w:rPr>
+        <w:t xml:space="preserve"> pada </w:t>
+      </w:r>
+      <w:proofErr w:type="spellStart"/>
+      <w:r>
+        <w:rPr>
+          <w:rFonts w:ascii="Bookman Old Style" w:hAnsi="Bookman Old Style"/>
+          <w:sz w:val="24"/>
+          <w:szCs w:val="24"/>
+        </w:rPr>
+        <w:t>ayat</w:t>
+      </w:r>
+      <w:proofErr w:type="spellEnd"/>
+      <w:r>
+        <w:rPr>
+          <w:rFonts w:ascii="Bookman Old Style" w:hAnsi="Bookman Old Style"/>
+          <w:sz w:val="24"/>
+          <w:szCs w:val="24"/>
+        </w:rPr>
+        <w:t xml:space="preserve"> (1) </w:t>
+      </w:r>
+      <w:proofErr w:type="spellStart"/>
+      <w:r>
+        <w:rPr>
+          <w:rFonts w:ascii="Bookman Old Style" w:hAnsi="Bookman Old Style"/>
+          <w:sz w:val="24"/>
+          <w:szCs w:val="24"/>
+        </w:rPr>
+        <w:t>huruf</w:t>
+      </w:r>
+      <w:proofErr w:type="spellEnd"/>
+      <w:r>
+        <w:rPr>
+          <w:rFonts w:ascii="Bookman Old Style" w:hAnsi="Bookman Old Style"/>
+          <w:sz w:val="24"/>
+          <w:szCs w:val="24"/>
+        </w:rPr>
+        <w:t xml:space="preserve"> e </w:t>
+      </w:r>
+      <w:proofErr w:type="spellStart"/>
+      <w:r>
+        <w:rPr>
+          <w:rFonts w:ascii="Bookman Old Style" w:hAnsi="Bookman Old Style"/>
+          <w:sz w:val="24"/>
+          <w:szCs w:val="24"/>
+        </w:rPr>
+        <w:t>diberikan</w:t>
+      </w:r>
+      <w:proofErr w:type="spellEnd"/>
+      <w:r>
+        <w:rPr>
+          <w:rFonts w:ascii="Bookman Old Style" w:hAnsi="Bookman Old Style"/>
+          <w:sz w:val="24"/>
+          <w:szCs w:val="24"/>
+        </w:rPr>
+        <w:t xml:space="preserve"> </w:t>
+      </w:r>
+      <w:proofErr w:type="spellStart"/>
+      <w:r>
+        <w:rPr>
+          <w:rFonts w:ascii="Bookman Old Style" w:hAnsi="Bookman Old Style"/>
+          <w:sz w:val="24"/>
+          <w:szCs w:val="24"/>
+        </w:rPr>
+        <w:t>kepada</w:t>
+      </w:r>
+      <w:proofErr w:type="spellEnd"/>
+      <w:r>
+        <w:rPr>
+          <w:rFonts w:ascii="Bookman Old Style" w:hAnsi="Bookman Old Style"/>
+          <w:sz w:val="24"/>
+          <w:szCs w:val="24"/>
+        </w:rPr>
+        <w:t xml:space="preserve"> </w:t>
+      </w:r>
+      <w:proofErr w:type="spellStart"/>
+      <w:r>
+        <w:rPr>
+          <w:rFonts w:ascii="Bookman Old Style" w:hAnsi="Bookman Old Style"/>
+          <w:sz w:val="24"/>
+          <w:szCs w:val="24"/>
+        </w:rPr>
+        <w:t>Pihak</w:t>
+      </w:r>
+      <w:proofErr w:type="spellEnd"/>
+      <w:r>
+        <w:rPr>
+          <w:rFonts w:ascii="Bookman Old Style" w:hAnsi="Bookman Old Style"/>
+          <w:sz w:val="24"/>
+          <w:szCs w:val="24"/>
+        </w:rPr>
+        <w:t xml:space="preserve"> </w:t>
+      </w:r>
+      <w:proofErr w:type="spellStart"/>
+      <w:r>
+        <w:rPr>
+          <w:rFonts w:ascii="Bookman Old Style" w:hAnsi="Bookman Old Style"/>
+          <w:sz w:val="24"/>
+          <w:szCs w:val="24"/>
+        </w:rPr>
+        <w:t>Kedua</w:t>
+      </w:r>
+      <w:proofErr w:type="spellEnd"/>
+      <w:r>
+        <w:rPr>
+          <w:rFonts w:ascii="Bookman Old Style" w:hAnsi="Bookman Old Style"/>
+          <w:sz w:val="24"/>
+          <w:szCs w:val="24"/>
+        </w:rPr>
+        <w:t xml:space="preserve"> </w:t>
+      </w:r>
+      <w:proofErr w:type="spellStart"/>
+      <w:r>
+        <w:rPr>
+          <w:rFonts w:ascii="Bookman Old Style" w:hAnsi="Bookman Old Style"/>
+          <w:sz w:val="24"/>
+          <w:szCs w:val="24"/>
+        </w:rPr>
+        <w:t>dalam</w:t>
+      </w:r>
+      <w:proofErr w:type="spellEnd"/>
+      <w:r>
+        <w:rPr>
+          <w:rFonts w:ascii="Bookman Old Style" w:hAnsi="Bookman Old Style"/>
+          <w:sz w:val="24"/>
+          <w:szCs w:val="24"/>
+        </w:rPr>
+        <w:t xml:space="preserve"> </w:t>
+      </w:r>
+      <w:proofErr w:type="spellStart"/>
+      <w:r>
+        <w:rPr>
+          <w:rFonts w:ascii="Bookman Old Style" w:hAnsi="Bookman Old Style"/>
+          <w:sz w:val="24"/>
+          <w:szCs w:val="24"/>
+        </w:rPr>
+        <w:t>perkara</w:t>
+      </w:r>
+      <w:proofErr w:type="spellEnd"/>
+      <w:r>
+        <w:rPr>
+          <w:rFonts w:ascii="Bookman Old Style" w:hAnsi="Bookman Old Style"/>
+          <w:sz w:val="24"/>
+          <w:szCs w:val="24"/>
+        </w:rPr>
+        <w:t xml:space="preserve"> yang </w:t>
+      </w:r>
+      <w:proofErr w:type="spellStart"/>
+      <w:r>
+        <w:rPr>
+          <w:rFonts w:ascii="Bookman Old Style" w:hAnsi="Bookman Old Style"/>
+          <w:sz w:val="24"/>
+          <w:szCs w:val="24"/>
+        </w:rPr>
+        <w:t>dihadapi</w:t>
+      </w:r>
+      <w:proofErr w:type="spellEnd"/>
+      <w:r>
+        <w:rPr>
+          <w:rFonts w:ascii="Bookman Old Style" w:hAnsi="Bookman Old Style"/>
+          <w:sz w:val="24"/>
+          <w:szCs w:val="24"/>
+        </w:rPr>
+        <w:t xml:space="preserve"> di </w:t>
+      </w:r>
+      <w:proofErr w:type="spellStart"/>
+      <w:r>
+        <w:rPr>
+          <w:rFonts w:ascii="Bookman Old Style" w:hAnsi="Bookman Old Style"/>
+          <w:sz w:val="24"/>
+          <w:szCs w:val="24"/>
+        </w:rPr>
+        <w:t>pengadilan</w:t>
+      </w:r>
+      <w:proofErr w:type="spellEnd"/>
+      <w:r>
+        <w:rPr>
+          <w:rFonts w:ascii="Bookman Old Style" w:hAnsi="Bookman Old Style"/>
+          <w:sz w:val="24"/>
+          <w:szCs w:val="24"/>
+        </w:rPr>
+        <w:t xml:space="preserve"> </w:t>
+      </w:r>
+      <w:proofErr w:type="spellStart"/>
+      <w:r>
+        <w:rPr>
+          <w:rFonts w:ascii="Bookman Old Style" w:hAnsi="Bookman Old Style"/>
+          <w:sz w:val="24"/>
+          <w:szCs w:val="24"/>
+        </w:rPr>
+        <w:t>terkait</w:t>
+      </w:r>
+      <w:proofErr w:type="spellEnd"/>
+      <w:r>
+        <w:rPr>
+          <w:rFonts w:ascii="Bookman Old Style" w:hAnsi="Bookman Old Style"/>
+          <w:sz w:val="24"/>
+          <w:szCs w:val="24"/>
+        </w:rPr>
+        <w:t xml:space="preserve"> </w:t>
+      </w:r>
+      <w:proofErr w:type="spellStart"/>
+      <w:r>
+        <w:rPr>
+          <w:rFonts w:ascii="Bookman Old Style" w:hAnsi="Bookman Old Style"/>
+          <w:sz w:val="24"/>
+          <w:szCs w:val="24"/>
+        </w:rPr>
+        <w:t>pelaksanaan</w:t>
+      </w:r>
+      <w:proofErr w:type="spellEnd"/>
+      <w:r>
+        <w:rPr>
+          <w:rFonts w:ascii="Bookman Old Style" w:hAnsi="Bookman Old Style"/>
+          <w:sz w:val="24"/>
+          <w:szCs w:val="24"/>
+        </w:rPr>
+        <w:t xml:space="preserve"> </w:t>
+      </w:r>
+      <w:proofErr w:type="spellStart"/>
+      <w:r>
+        <w:rPr>
+          <w:rFonts w:ascii="Bookman Old Style" w:hAnsi="Bookman Old Style"/>
+          <w:sz w:val="24"/>
+          <w:szCs w:val="24"/>
+        </w:rPr>
+        <w:t>tugas</w:t>
+      </w:r>
+      <w:proofErr w:type="spellEnd"/>
+      <w:r>
+        <w:rPr>
+          <w:rFonts w:ascii="Bookman Old Style" w:hAnsi="Bookman Old Style"/>
+          <w:sz w:val="24"/>
+          <w:szCs w:val="24"/>
+        </w:rPr>
+        <w:t>.</w:t>
       </w:r>
     </w:p>
     <w:p>
@@ -5388,13 +8952,59 @@
           <w:szCs w:val="24"/>
         </w:rPr>
       </w:pPr>
-      <w:r>
-        <w:rPr>
-          <w:rFonts w:ascii="Bookman Old Style" w:hAnsi="Bookman Old Style"/>
-          <w:sz w:val="24"/>
-          <w:szCs w:val="24"/>
-        </w:rPr>
-        <w:t>Pihak Kedua meninggal dunia;</w:t>
+      <w:proofErr w:type="spellStart"/>
+      <w:r>
+        <w:rPr>
+          <w:rFonts w:ascii="Bookman Old Style" w:hAnsi="Bookman Old Style"/>
+          <w:sz w:val="24"/>
+          <w:szCs w:val="24"/>
+        </w:rPr>
+        <w:t>Pihak</w:t>
+      </w:r>
+      <w:proofErr w:type="spellEnd"/>
+      <w:r>
+        <w:rPr>
+          <w:rFonts w:ascii="Bookman Old Style" w:hAnsi="Bookman Old Style"/>
+          <w:sz w:val="24"/>
+          <w:szCs w:val="24"/>
+        </w:rPr>
+        <w:t xml:space="preserve"> </w:t>
+      </w:r>
+      <w:proofErr w:type="spellStart"/>
+      <w:r>
+        <w:rPr>
+          <w:rFonts w:ascii="Bookman Old Style" w:hAnsi="Bookman Old Style"/>
+          <w:sz w:val="24"/>
+          <w:szCs w:val="24"/>
+        </w:rPr>
+        <w:t>Kedua</w:t>
+      </w:r>
+      <w:proofErr w:type="spellEnd"/>
+      <w:r>
+        <w:rPr>
+          <w:rFonts w:ascii="Bookman Old Style" w:hAnsi="Bookman Old Style"/>
+          <w:sz w:val="24"/>
+          <w:szCs w:val="24"/>
+        </w:rPr>
+        <w:t xml:space="preserve"> </w:t>
+      </w:r>
+      <w:proofErr w:type="spellStart"/>
+      <w:r>
+        <w:rPr>
+          <w:rFonts w:ascii="Bookman Old Style" w:hAnsi="Bookman Old Style"/>
+          <w:sz w:val="24"/>
+          <w:szCs w:val="24"/>
+        </w:rPr>
+        <w:t>meninggal</w:t>
+      </w:r>
+      <w:proofErr w:type="spellEnd"/>
+      <w:r>
+        <w:rPr>
+          <w:rFonts w:ascii="Bookman Old Style" w:hAnsi="Bookman Old Style"/>
+          <w:sz w:val="24"/>
+          <w:szCs w:val="24"/>
+        </w:rPr>
+        <w:t xml:space="preserve"> dunia;</w:t>
       </w:r>
     </w:p>
     <w:p>
@@ -6020,8 +9630,9 @@
           <w:szCs w:val="24"/>
         </w:rPr>
         <w:lastRenderedPageBreak/>
-        <w:t>{{/perjanjian}</w:t>
-      </w:r>
+        <w:t>{{/</w:t>
+      </w:r>
+      <w:proofErr w:type="spellStart"/>
       <w:r>
         <w:rPr>
           <w:rFonts w:ascii="Bookman Old Style" w:hAnsi="Bookman Old Style"/>
@@ -6029,6 +9640,16 @@
           <w:sz w:val="24"/>
           <w:szCs w:val="24"/>
         </w:rPr>
+        <w:t>perjanjian</w:t>
+      </w:r>
+      <w:proofErr w:type="spellEnd"/>
+      <w:r>
+        <w:rPr>
+          <w:rFonts w:ascii="Bookman Old Style" w:hAnsi="Bookman Old Style"/>
+          <w:b/>
+          <w:sz w:val="24"/>
+          <w:szCs w:val="24"/>
+        </w:rPr>
         <w:t>}</w:t>
       </w:r>
       <w:r>
@@ -6038,7 +9659,7 @@
           <w:sz w:val="24"/>
           <w:szCs w:val="24"/>
         </w:rPr>
-        <w:t>{{#tandatangan}}</w:t>
+        <w:t>}</w:t>
       </w:r>
     </w:p>
     <w:p>
@@ -6063,7 +9684,43 @@
           <w:sz w:val="24"/>
           <w:szCs w:val="24"/>
         </w:rPr>
-        <w:t>Pasal 13</w:t>
+        <w:t>{{#tandatangan}}</w:t>
+      </w:r>
+    </w:p>
+    <w:p>
+      <w:pPr>
+        <w:tabs>
+          <w:tab w:val="left" w:pos="426"/>
+          <w:tab w:val="left" w:pos="851"/>
+        </w:tabs>
+        <w:spacing w:after="120" w:line="240" w:lineRule="auto"/>
+        <w:jc w:val="center"/>
+        <w:rPr>
+          <w:rFonts w:ascii="Bookman Old Style" w:hAnsi="Bookman Old Style"/>
+          <w:b/>
+          <w:sz w:val="24"/>
+          <w:szCs w:val="24"/>
+        </w:rPr>
+      </w:pPr>
+      <w:proofErr w:type="spellStart"/>
+      <w:r>
+        <w:rPr>
+          <w:rFonts w:ascii="Bookman Old Style" w:hAnsi="Bookman Old Style"/>
+          <w:b/>
+          <w:sz w:val="24"/>
+          <w:szCs w:val="24"/>
+        </w:rPr>
+        <w:t>Pasal</w:t>
+      </w:r>
+      <w:proofErr w:type="spellEnd"/>
+      <w:r>
+        <w:rPr>
+          <w:rFonts w:ascii="Bookman Old Style" w:hAnsi="Bookman Old Style"/>
+          <w:b/>
+          <w:sz w:val="24"/>
+          <w:szCs w:val="24"/>
+        </w:rPr>
+        <w:t xml:space="preserve"> 13</w:t>
       </w:r>
     </w:p>
     <w:p>
@@ -6110,13 +9767,293 @@
           <w:szCs w:val="24"/>
         </w:rPr>
       </w:pPr>
-      <w:r>
-        <w:rPr>
-          <w:rFonts w:ascii="Bookman Old Style" w:hAnsi="Bookman Old Style"/>
-          <w:sz w:val="24"/>
-          <w:szCs w:val="24"/>
-        </w:rPr>
-        <w:t>Pihak Kedua bersedia melaksanakan seluruh ketentuan yang telah diatur dalam peraturan kedinasan dan peraturan lainnya yang berlaku di Pihak Kesatu.</w:t>
+      <w:proofErr w:type="spellStart"/>
+      <w:r>
+        <w:rPr>
+          <w:rFonts w:ascii="Bookman Old Style" w:hAnsi="Bookman Old Style"/>
+          <w:sz w:val="24"/>
+          <w:szCs w:val="24"/>
+        </w:rPr>
+        <w:t>Pihak</w:t>
+      </w:r>
+      <w:proofErr w:type="spellEnd"/>
+      <w:r>
+        <w:rPr>
+          <w:rFonts w:ascii="Bookman Old Style" w:hAnsi="Bookman Old Style"/>
+          <w:sz w:val="24"/>
+          <w:szCs w:val="24"/>
+        </w:rPr>
+        <w:t xml:space="preserve"> </w:t>
+      </w:r>
+      <w:proofErr w:type="spellStart"/>
+      <w:r>
+        <w:rPr>
+          <w:rFonts w:ascii="Bookman Old Style" w:hAnsi="Bookman Old Style"/>
+          <w:sz w:val="24"/>
+          <w:szCs w:val="24"/>
+        </w:rPr>
+        <w:t>Kedua</w:t>
+      </w:r>
+      <w:proofErr w:type="spellEnd"/>
+      <w:r>
+        <w:rPr>
+          <w:rFonts w:ascii="Bookman Old Style" w:hAnsi="Bookman Old Style"/>
+          <w:sz w:val="24"/>
+          <w:szCs w:val="24"/>
+        </w:rPr>
+        <w:t xml:space="preserve"> </w:t>
+      </w:r>
+      <w:proofErr w:type="spellStart"/>
+      <w:r>
+        <w:rPr>
+          <w:rFonts w:ascii="Bookman Old Style" w:hAnsi="Bookman Old Style"/>
+          <w:sz w:val="24"/>
+          <w:szCs w:val="24"/>
+        </w:rPr>
+        <w:t>bersedia</w:t>
+      </w:r>
+      <w:proofErr w:type="spellEnd"/>
+      <w:r>
+        <w:rPr>
+          <w:rFonts w:ascii="Bookman Old Style" w:hAnsi="Bookman Old Style"/>
+          <w:sz w:val="24"/>
+          <w:szCs w:val="24"/>
+        </w:rPr>
+        <w:t xml:space="preserve"> </w:t>
+      </w:r>
+      <w:proofErr w:type="spellStart"/>
+      <w:r>
+        <w:rPr>
+          <w:rFonts w:ascii="Bookman Old Style" w:hAnsi="Bookman Old Style"/>
+          <w:sz w:val="24"/>
+          <w:szCs w:val="24"/>
+        </w:rPr>
+        <w:t>melaksanakan</w:t>
+      </w:r>
+      <w:proofErr w:type="spellEnd"/>
+      <w:r>
+        <w:rPr>
+          <w:rFonts w:ascii="Bookman Old Style" w:hAnsi="Bookman Old Style"/>
+          <w:sz w:val="24"/>
+          <w:szCs w:val="24"/>
+        </w:rPr>
+        <w:t xml:space="preserve"> </w:t>
+      </w:r>
+      <w:proofErr w:type="spellStart"/>
+      <w:r>
+        <w:rPr>
+          <w:rFonts w:ascii="Bookman Old Style" w:hAnsi="Bookman Old Style"/>
+          <w:sz w:val="24"/>
+          <w:szCs w:val="24"/>
+        </w:rPr>
+        <w:t>seluruh</w:t>
+      </w:r>
+      <w:proofErr w:type="spellEnd"/>
+      <w:r>
+        <w:rPr>
+          <w:rFonts w:ascii="Bookman Old Style" w:hAnsi="Bookman Old Style"/>
+          <w:sz w:val="24"/>
+          <w:szCs w:val="24"/>
+        </w:rPr>
+        <w:t xml:space="preserve"> </w:t>
+      </w:r>
+      <w:proofErr w:type="spellStart"/>
+      <w:r>
+        <w:rPr>
+          <w:rFonts w:ascii="Bookman Old Style" w:hAnsi="Bookman Old Style"/>
+          <w:sz w:val="24"/>
+          <w:szCs w:val="24"/>
+        </w:rPr>
+        <w:t>ketentuan</w:t>
+      </w:r>
+      <w:proofErr w:type="spellEnd"/>
+      <w:r>
+        <w:rPr>
+          <w:rFonts w:ascii="Bookman Old Style" w:hAnsi="Bookman Old Style"/>
+          <w:sz w:val="24"/>
+          <w:szCs w:val="24"/>
+        </w:rPr>
+        <w:t xml:space="preserve"> yang </w:t>
+      </w:r>
+      <w:proofErr w:type="spellStart"/>
+      <w:r>
+        <w:rPr>
+          <w:rFonts w:ascii="Bookman Old Style" w:hAnsi="Bookman Old Style"/>
+          <w:sz w:val="24"/>
+          <w:szCs w:val="24"/>
+        </w:rPr>
+        <w:t>telah</w:t>
+      </w:r>
+      <w:proofErr w:type="spellEnd"/>
+      <w:r>
+        <w:rPr>
+          <w:rFonts w:ascii="Bookman Old Style" w:hAnsi="Bookman Old Style"/>
+          <w:sz w:val="24"/>
+          <w:szCs w:val="24"/>
+        </w:rPr>
+        <w:t xml:space="preserve"> </w:t>
+      </w:r>
+      <w:proofErr w:type="spellStart"/>
+      <w:r>
+        <w:rPr>
+          <w:rFonts w:ascii="Bookman Old Style" w:hAnsi="Bookman Old Style"/>
+          <w:sz w:val="24"/>
+          <w:szCs w:val="24"/>
+        </w:rPr>
+        <w:t>diatur</w:t>
+      </w:r>
+      <w:proofErr w:type="spellEnd"/>
+      <w:r>
+        <w:rPr>
+          <w:rFonts w:ascii="Bookman Old Style" w:hAnsi="Bookman Old Style"/>
+          <w:sz w:val="24"/>
+          <w:szCs w:val="24"/>
+        </w:rPr>
+        <w:t xml:space="preserve"> </w:t>
+      </w:r>
+      <w:proofErr w:type="spellStart"/>
+      <w:r>
+        <w:rPr>
+          <w:rFonts w:ascii="Bookman Old Style" w:hAnsi="Bookman Old Style"/>
+          <w:sz w:val="24"/>
+          <w:szCs w:val="24"/>
+        </w:rPr>
+        <w:t>dalam</w:t>
+      </w:r>
+      <w:proofErr w:type="spellEnd"/>
+      <w:r>
+        <w:rPr>
+          <w:rFonts w:ascii="Bookman Old Style" w:hAnsi="Bookman Old Style"/>
+          <w:sz w:val="24"/>
+          <w:szCs w:val="24"/>
+        </w:rPr>
+        <w:t xml:space="preserve"> </w:t>
+      </w:r>
+      <w:proofErr w:type="spellStart"/>
+      <w:r>
+        <w:rPr>
+          <w:rFonts w:ascii="Bookman Old Style" w:hAnsi="Bookman Old Style"/>
+          <w:sz w:val="24"/>
+          <w:szCs w:val="24"/>
+        </w:rPr>
+        <w:t>peraturan</w:t>
+      </w:r>
+      <w:proofErr w:type="spellEnd"/>
+      <w:r>
+        <w:rPr>
+          <w:rFonts w:ascii="Bookman Old Style" w:hAnsi="Bookman Old Style"/>
+          <w:sz w:val="24"/>
+          <w:szCs w:val="24"/>
+        </w:rPr>
+        <w:t xml:space="preserve"> </w:t>
+      </w:r>
+      <w:proofErr w:type="spellStart"/>
+      <w:r>
+        <w:rPr>
+          <w:rFonts w:ascii="Bookman Old Style" w:hAnsi="Bookman Old Style"/>
+          <w:sz w:val="24"/>
+          <w:szCs w:val="24"/>
+        </w:rPr>
+        <w:t>kedinasan</w:t>
+      </w:r>
+      <w:proofErr w:type="spellEnd"/>
+      <w:r>
+        <w:rPr>
+          <w:rFonts w:ascii="Bookman Old Style" w:hAnsi="Bookman Old Style"/>
+          <w:sz w:val="24"/>
+          <w:szCs w:val="24"/>
+        </w:rPr>
+        <w:t xml:space="preserve"> dan </w:t>
+      </w:r>
+      <w:proofErr w:type="spellStart"/>
+      <w:r>
+        <w:rPr>
+          <w:rFonts w:ascii="Bookman Old Style" w:hAnsi="Bookman Old Style"/>
+          <w:sz w:val="24"/>
+          <w:szCs w:val="24"/>
+        </w:rPr>
+        <w:t>peraturan</w:t>
+      </w:r>
+      <w:proofErr w:type="spellEnd"/>
+      <w:r>
+        <w:rPr>
+          <w:rFonts w:ascii="Bookman Old Style" w:hAnsi="Bookman Old Style"/>
+          <w:sz w:val="24"/>
+          <w:szCs w:val="24"/>
+        </w:rPr>
+        <w:t xml:space="preserve"> </w:t>
+      </w:r>
+      <w:proofErr w:type="spellStart"/>
+      <w:r>
+        <w:rPr>
+          <w:rFonts w:ascii="Bookman Old Style" w:hAnsi="Bookman Old Style"/>
+          <w:sz w:val="24"/>
+          <w:szCs w:val="24"/>
+        </w:rPr>
+        <w:t>lainnya</w:t>
+      </w:r>
+      <w:proofErr w:type="spellEnd"/>
+      <w:r>
+        <w:rPr>
+          <w:rFonts w:ascii="Bookman Old Style" w:hAnsi="Bookman Old Style"/>
+          <w:sz w:val="24"/>
+          <w:szCs w:val="24"/>
+        </w:rPr>
+        <w:t xml:space="preserve"> yang </w:t>
+      </w:r>
+      <w:proofErr w:type="spellStart"/>
+      <w:r>
+        <w:rPr>
+          <w:rFonts w:ascii="Bookman Old Style" w:hAnsi="Bookman Old Style"/>
+          <w:sz w:val="24"/>
+          <w:szCs w:val="24"/>
+        </w:rPr>
+        <w:t>berlaku</w:t>
+      </w:r>
+      <w:proofErr w:type="spellEnd"/>
+      <w:r>
+        <w:rPr>
+          <w:rFonts w:ascii="Bookman Old Style" w:hAnsi="Bookman Old Style"/>
+          <w:sz w:val="24"/>
+          <w:szCs w:val="24"/>
+        </w:rPr>
+        <w:t xml:space="preserve"> di </w:t>
+      </w:r>
+      <w:proofErr w:type="spellStart"/>
+      <w:r>
+        <w:rPr>
+          <w:rFonts w:ascii="Bookman Old Style" w:hAnsi="Bookman Old Style"/>
+          <w:sz w:val="24"/>
+          <w:szCs w:val="24"/>
+        </w:rPr>
+        <w:t>Pihak</w:t>
+      </w:r>
+      <w:proofErr w:type="spellEnd"/>
+      <w:r>
+        <w:rPr>
+          <w:rFonts w:ascii="Bookman Old Style" w:hAnsi="Bookman Old Style"/>
+          <w:sz w:val="24"/>
+          <w:szCs w:val="24"/>
+        </w:rPr>
+        <w:t xml:space="preserve"> </w:t>
+      </w:r>
+      <w:proofErr w:type="spellStart"/>
+      <w:r>
+        <w:rPr>
+          <w:rFonts w:ascii="Bookman Old Style" w:hAnsi="Bookman Old Style"/>
+          <w:sz w:val="24"/>
+          <w:szCs w:val="24"/>
+        </w:rPr>
+        <w:t>Kesatu</w:t>
+      </w:r>
+      <w:proofErr w:type="spellEnd"/>
+      <w:r>
+        <w:rPr>
+          <w:rFonts w:ascii="Bookman Old Style" w:hAnsi="Bookman Old Style"/>
+          <w:sz w:val="24"/>
+          <w:szCs w:val="24"/>
+        </w:rPr>
+        <w:t>.</w:t>
       </w:r>
     </w:p>
     <w:p>
@@ -6482,7 +10419,27 @@
           <w:sz w:val="24"/>
           <w:szCs w:val="24"/>
         </w:rPr>
-        <w:t>{{/tandatangan}}</w:t>
+        <w:t>{{/</w:t>
+      </w:r>
+      <w:proofErr w:type="spellStart"/>
+      <w:r>
+        <w:rPr>
+          <w:rFonts w:ascii="Bookman Old Style" w:hAnsi="Bookman Old Style"/>
+          <w:b/>
+          <w:sz w:val="24"/>
+          <w:szCs w:val="24"/>
+        </w:rPr>
+        <w:t>tandatangan</w:t>
+      </w:r>
+      <w:proofErr w:type="spellEnd"/>
+      <w:r>
+        <w:rPr>
+          <w:rFonts w:ascii="Bookman Old Style" w:hAnsi="Bookman Old Style"/>
+          <w:b/>
+          <w:sz w:val="24"/>
+          <w:szCs w:val="24"/>
+        </w:rPr>
+        <w:t>}}</w:t>
       </w:r>
     </w:p>
     <w:p>
@@ -6501,7 +10458,7 @@
       </w:pPr>
     </w:p>
     <w:sectPr>
-      <w:pgSz w:w="11906" w:h="18709" w:code="10000"/>
+      <w:pgSz w:w="12240" w:h="20160" w:code="5"/>
       <w:pgMar w:top="851" w:right="851" w:bottom="2552" w:left="1134" w:header="709" w:footer="709" w:gutter="0"/>
       <w:cols w:space="708"/>
       <w:docGrid w:linePitch="360"/>

</xml_diff>